<commit_message>
Task 1 commited (fixed)
</commit_message>
<xml_diff>
--- a/Task 1/Introduction_to_DWH_and_ETL_Business_Template.docx
+++ b/Task 1/Introduction_to_DWH_and_ETL_Business_Template.docx
@@ -1401,7 +1401,15 @@
         <w:t>Balaji Fast Food Sales</w:t>
       </w:r>
       <w:r>
-        <w:t xml:space="preserve"> specializes in serving a variety of high-quality fast food items that cater to diverse tastes and preferences. In this competitive market, success depends on understanding customer preferences, sales trends, and operational efficiency. To excel, it is crucial to systematically gather and analyze data on sales, customer behavior, and product performance.</w:t>
+        <w:t xml:space="preserve"> specializes in serving a variety of high-quality </w:t>
+      </w:r>
+      <w:proofErr w:type="gramStart"/>
+      <w:r>
+        <w:t>fast food</w:t>
+      </w:r>
+      <w:proofErr w:type="gramEnd"/>
+      <w:r>
+        <w:t xml:space="preserve"> items that cater to diverse tastes and preferences. In this competitive market, success depends on understanding customer preferences, sales trends, and operational efficiency. To excel, it is crucial to systematically gather and analyze data on sales, customer behavior, and product performance.</w:t>
       </w:r>
     </w:p>
     <w:p>
@@ -1501,7 +1509,15 @@
         </w:numPr>
       </w:pPr>
       <w:r>
-        <w:t>Lack of insights into customer buying patterns, hampering marketing efforts.</w:t>
+        <w:t xml:space="preserve">Lack of </w:t>
+      </w:r>
+      <w:proofErr w:type="gramStart"/>
+      <w:r>
+        <w:t>insights</w:t>
+      </w:r>
+      <w:proofErr w:type="gramEnd"/>
+      <w:r>
+        <w:t xml:space="preserve"> into customer buying patterns, hampering marketing efforts.</w:t>
       </w:r>
     </w:p>
     <w:p>
@@ -1722,7 +1738,15 @@
         <w:t xml:space="preserve"> contains the following entities and their attributes, with additional details</w:t>
       </w:r>
       <w:r>
-        <w:t xml:space="preserve"> witr card Payments</w:t>
+        <w:t xml:space="preserve"> </w:t>
+      </w:r>
+      <w:proofErr w:type="spellStart"/>
+      <w:r>
+        <w:t>witr</w:t>
+      </w:r>
+      <w:proofErr w:type="spellEnd"/>
+      <w:r>
+        <w:t xml:space="preserve"> card Payments</w:t>
       </w:r>
       <w:r>
         <w:t>:</w:t>
@@ -1763,7 +1787,15 @@
         <w:t>Point Name:</w:t>
       </w:r>
       <w:r>
-        <w:t xml:space="preserve"> The name of the fast food outlet (e.g., Balaji_1, Balaji_2).</w:t>
+        <w:t xml:space="preserve"> The name of the </w:t>
+      </w:r>
+      <w:proofErr w:type="gramStart"/>
+      <w:r>
+        <w:t>fast food</w:t>
+      </w:r>
+      <w:proofErr w:type="gramEnd"/>
+      <w:r>
+        <w:t xml:space="preserve"> outlet (e.g., Balaji_1, Balaji_2).</w:t>
       </w:r>
     </w:p>
     <w:p>
@@ -1774,6 +1806,13 @@
           <w:numId w:val="46"/>
         </w:numPr>
       </w:pPr>
+      <w:r>
+        <w:rPr>
+          <w:b/>
+          <w:bCs/>
+        </w:rPr>
+        <w:t xml:space="preserve">Point </w:t>
+      </w:r>
       <w:r>
         <w:rPr>
           <w:b/>
@@ -1798,10 +1837,25 @@
           <w:b/>
           <w:bCs/>
         </w:rPr>
+        <w:t xml:space="preserve">Point </w:t>
+      </w:r>
+      <w:r>
+        <w:rPr>
+          <w:b/>
+          <w:bCs/>
+        </w:rPr>
         <w:t>Address:</w:t>
       </w:r>
       <w:r>
-        <w:t xml:space="preserve"> The exact address of the outlet (e.g., Satpaeva 127, Abay 99).</w:t>
+        <w:t xml:space="preserve"> The exact address of the outlet (e.g., </w:t>
+      </w:r>
+      <w:proofErr w:type="spellStart"/>
+      <w:r>
+        <w:t>Satpaeva</w:t>
+      </w:r>
+      <w:proofErr w:type="spellEnd"/>
+      <w:r>
+        <w:t xml:space="preserve"> 127, Abay 99).</w:t>
       </w:r>
     </w:p>
     <w:p>
@@ -1812,6 +1866,13 @@
           <w:numId w:val="46"/>
         </w:numPr>
       </w:pPr>
+      <w:r>
+        <w:rPr>
+          <w:b/>
+          <w:bCs/>
+        </w:rPr>
+        <w:t xml:space="preserve">Point </w:t>
+      </w:r>
       <w:r>
         <w:rPr>
           <w:b/>
@@ -1884,7 +1945,71 @@
         <w:tab/>
       </w:r>
       <w:r>
-        <w:t>Country (Country_ID, country_name)-&gt;City(City_ID, city_name, Country_ID(FK))-&gt;Fast food point (Point_ID, Address, City_ID(FK)</w:t>
+        <w:t>Country (</w:t>
+      </w:r>
+      <w:proofErr w:type="spellStart"/>
+      <w:r>
+        <w:t>Country_ID</w:t>
+      </w:r>
+      <w:proofErr w:type="spellEnd"/>
+      <w:r>
+        <w:t xml:space="preserve">, </w:t>
+      </w:r>
+      <w:proofErr w:type="spellStart"/>
+      <w:r>
+        <w:t>country_name</w:t>
+      </w:r>
+      <w:proofErr w:type="spellEnd"/>
+      <w:r>
+        <w:t>)-&gt;</w:t>
+      </w:r>
+      <w:proofErr w:type="gramStart"/>
+      <w:r>
+        <w:t>City(</w:t>
+      </w:r>
+      <w:proofErr w:type="spellStart"/>
+      <w:proofErr w:type="gramEnd"/>
+      <w:r>
+        <w:t>City_ID</w:t>
+      </w:r>
+      <w:proofErr w:type="spellEnd"/>
+      <w:r>
+        <w:t xml:space="preserve">, </w:t>
+      </w:r>
+      <w:proofErr w:type="spellStart"/>
+      <w:r>
+        <w:t>C</w:t>
+      </w:r>
+      <w:r>
+        <w:t>ity_name</w:t>
+      </w:r>
+      <w:proofErr w:type="spellEnd"/>
+      <w:r>
+        <w:t xml:space="preserve">, </w:t>
+      </w:r>
+      <w:proofErr w:type="spellStart"/>
+      <w:r>
+        <w:t>Country_ID</w:t>
+      </w:r>
+      <w:proofErr w:type="spellEnd"/>
+      <w:r>
+        <w:t>(FK))-&gt;Fast food point (</w:t>
+      </w:r>
+      <w:proofErr w:type="spellStart"/>
+      <w:r>
+        <w:t>Point_ID</w:t>
+      </w:r>
+      <w:proofErr w:type="spellEnd"/>
+      <w:r>
+        <w:t xml:space="preserve">, Address, </w:t>
+      </w:r>
+      <w:proofErr w:type="spellStart"/>
+      <w:r>
+        <w:t>City_ID</w:t>
+      </w:r>
+      <w:proofErr w:type="spellEnd"/>
+      <w:r>
+        <w:t>(FK)</w:t>
       </w:r>
       <w:r>
         <w:t>)</w:t>
@@ -1926,10 +2051,36 @@
           <w:b/>
           <w:bCs/>
         </w:rPr>
-        <w:t>Customer Name:</w:t>
+        <w:t xml:space="preserve">Customer </w:t>
+      </w:r>
+      <w:r>
+        <w:rPr>
+          <w:b/>
+          <w:bCs/>
+        </w:rPr>
+        <w:t xml:space="preserve">First/Last </w:t>
+      </w:r>
+      <w:r>
+        <w:rPr>
+          <w:b/>
+          <w:bCs/>
+        </w:rPr>
+        <w:t>Name:</w:t>
       </w:r>
       <w:r>
         <w:t xml:space="preserve"> The name of the customer (e.g., generated using Faker for anonymization).</w:t>
+      </w:r>
+    </w:p>
+    <w:p>
+      <w:pPr>
+        <w:pStyle w:val="a2"/>
+        <w:numPr>
+          <w:ilvl w:val="0"/>
+          <w:numId w:val="47"/>
+        </w:numPr>
+      </w:pPr>
+      <w:r>
+        <w:t>Customer Phone Number</w:t>
       </w:r>
     </w:p>
     <w:p>
@@ -1973,26 +2124,34 @@
       </w:pPr>
       <w:r>
         <w:tab/>
+      </w:r>
+      <w:proofErr w:type="spellStart"/>
+      <w:r>
         <w:t>Cust_id</w:t>
       </w:r>
+      <w:proofErr w:type="spellEnd"/>
     </w:p>
     <w:p>
       <w:pPr>
         <w:pStyle w:val="a2"/>
         <w:ind w:left="720" w:firstLine="720"/>
       </w:pPr>
+      <w:proofErr w:type="spellStart"/>
       <w:r>
         <w:t>First_name</w:t>
       </w:r>
+      <w:proofErr w:type="spellEnd"/>
     </w:p>
     <w:p>
       <w:pPr>
         <w:pStyle w:val="a2"/>
         <w:ind w:left="720" w:firstLine="720"/>
       </w:pPr>
+      <w:proofErr w:type="spellStart"/>
       <w:r>
         <w:t>Last_name</w:t>
       </w:r>
+      <w:proofErr w:type="spellEnd"/>
       <w:r>
         <w:br/>
       </w:r>
@@ -2091,8 +2250,12 @@
       </w:pPr>
       <w:r>
         <w:tab/>
+      </w:r>
+      <w:proofErr w:type="spellStart"/>
+      <w:r>
         <w:t>Discount_ID</w:t>
       </w:r>
+      <w:proofErr w:type="spellEnd"/>
     </w:p>
     <w:p>
       <w:pPr>
@@ -2101,8 +2264,12 @@
       </w:pPr>
       <w:r>
         <w:tab/>
+      </w:r>
+      <w:proofErr w:type="spellStart"/>
+      <w:r>
         <w:t>Date_of_discount</w:t>
       </w:r>
+      <w:proofErr w:type="spellEnd"/>
     </w:p>
     <w:p>
       <w:pPr>
@@ -2147,10 +2314,33 @@
           <w:b/>
           <w:bCs/>
         </w:rPr>
-        <w:t>Item Name:</w:t>
-      </w:r>
-      <w:r>
-        <w:t xml:space="preserve"> The name of the product sold (e.g., Aalopuri, Panipuri, Cold Coffee).</w:t>
+        <w:t>Product</w:t>
+      </w:r>
+      <w:r>
+        <w:rPr>
+          <w:b/>
+          <w:bCs/>
+        </w:rPr>
+        <w:t xml:space="preserve"> Name:</w:t>
+      </w:r>
+      <w:r>
+        <w:t xml:space="preserve"> The name of the product sold (e.g., </w:t>
+      </w:r>
+      <w:proofErr w:type="spellStart"/>
+      <w:r>
+        <w:t>Aalopuri</w:t>
+      </w:r>
+      <w:proofErr w:type="spellEnd"/>
+      <w:r>
+        <w:t xml:space="preserve">, </w:t>
+      </w:r>
+      <w:proofErr w:type="spellStart"/>
+      <w:r>
+        <w:t>Panipuri</w:t>
+      </w:r>
+      <w:proofErr w:type="spellEnd"/>
+      <w:r>
+        <w:t>, Cold Coffee).</w:t>
       </w:r>
     </w:p>
     <w:p>
@@ -2166,11 +2356,19 @@
           <w:b/>
           <w:bCs/>
         </w:rPr>
-        <w:t>Item Type:</w:t>
+        <w:t>Product</w:t>
+      </w:r>
+      <w:r>
+        <w:rPr>
+          <w:b/>
+          <w:bCs/>
+        </w:rPr>
+        <w:t xml:space="preserve"> Type:</w:t>
       </w:r>
       <w:r>
         <w:t xml:space="preserve"> The category of the product, either </w:t>
       </w:r>
+      <w:proofErr w:type="spellStart"/>
       <w:r>
         <w:rPr>
           <w:i/>
@@ -2178,6 +2376,7 @@
         </w:rPr>
         <w:t>Fastfood</w:t>
       </w:r>
+      <w:proofErr w:type="spellEnd"/>
       <w:r>
         <w:t xml:space="preserve"> or </w:t>
       </w:r>
@@ -2220,6 +2419,13 @@
           <w:bCs/>
         </w:rPr>
         <w:tab/>
+      </w:r>
+      <w:proofErr w:type="gramStart"/>
+      <w:r>
+        <w:rPr>
+          <w:b/>
+          <w:bCs/>
+        </w:rPr>
         <w:t>Category</w:t>
       </w:r>
       <w:r>
@@ -2235,7 +2441,15 @@
           <w:bCs/>
         </w:rPr>
         <w:tab/>
-        <w:t>-&gt;</w:t>
+        <w:t>-</w:t>
+      </w:r>
+      <w:proofErr w:type="gramEnd"/>
+      <w:r>
+        <w:rPr>
+          <w:b/>
+          <w:bCs/>
+        </w:rPr>
+        <w:t>&gt;</w:t>
       </w:r>
       <w:r>
         <w:rPr>
@@ -2251,9 +2465,11 @@
         <w:pStyle w:val="a2"/>
         <w:ind w:left="720" w:firstLine="720"/>
       </w:pPr>
+      <w:proofErr w:type="spellStart"/>
       <w:r>
         <w:t>Category_ID</w:t>
       </w:r>
+      <w:proofErr w:type="spellEnd"/>
       <w:r>
         <w:tab/>
       </w:r>
@@ -2262,8 +2478,12 @@
       </w:r>
       <w:r>
         <w:tab/>
+      </w:r>
+      <w:proofErr w:type="spellStart"/>
+      <w:r>
         <w:t>Prod_ID</w:t>
       </w:r>
+      <w:proofErr w:type="spellEnd"/>
     </w:p>
     <w:p>
       <w:pPr>
@@ -2272,8 +2492,12 @@
       </w:pPr>
       <w:r>
         <w:tab/>
+      </w:r>
+      <w:proofErr w:type="spellStart"/>
+      <w:r>
         <w:t>Category_name</w:t>
       </w:r>
+      <w:proofErr w:type="spellEnd"/>
       <w:r>
         <w:tab/>
       </w:r>
@@ -2304,8 +2528,41 @@
       </w:r>
       <w:r>
         <w:tab/>
-        <w:t>Category_ID (FK)</w:t>
-      </w:r>
+      </w:r>
+      <w:proofErr w:type="spellStart"/>
+      <w:r>
+        <w:t>Category_ID</w:t>
+      </w:r>
+      <w:proofErr w:type="spellEnd"/>
+      <w:r>
+        <w:t xml:space="preserve"> (FK)</w:t>
+      </w:r>
+    </w:p>
+    <w:p>
+      <w:pPr>
+        <w:pStyle w:val="a2"/>
+        <w:ind w:left="720"/>
+      </w:pPr>
+      <w:r>
+        <w:tab/>
+      </w:r>
+      <w:r>
+        <w:tab/>
+      </w:r>
+      <w:r>
+        <w:tab/>
+      </w:r>
+      <w:r>
+        <w:tab/>
+      </w:r>
+      <w:r>
+        <w:tab/>
+      </w:r>
+      <w:proofErr w:type="spellStart"/>
+      <w:r>
+        <w:t>Prod_price</w:t>
+      </w:r>
+      <w:proofErr w:type="spellEnd"/>
     </w:p>
     <w:p>
       <w:pPr>
@@ -2383,8 +2640,12 @@
       </w:pPr>
       <w:r>
         <w:tab/>
+      </w:r>
+      <w:proofErr w:type="spellStart"/>
+      <w:r>
         <w:t>Day_of_week</w:t>
       </w:r>
+      <w:proofErr w:type="spellEnd"/>
     </w:p>
     <w:p>
       <w:pPr>
@@ -2458,6 +2719,674 @@
         <w:numPr>
           <w:ilvl w:val="0"/>
           <w:numId w:val="51"/>
+        </w:numPr>
+      </w:pPr>
+      <w:r>
+        <w:rPr>
+          <w:b/>
+          <w:bCs/>
+        </w:rPr>
+        <w:t>Employee:</w:t>
+      </w:r>
+      <w:r>
+        <w:t xml:space="preserve"> The name of the employee responsible for the transaction (e.g., Dan Yohan, Johan Maretti).</w:t>
+      </w:r>
+    </w:p>
+    <w:p>
+      <w:pPr>
+        <w:pStyle w:val="a2"/>
+        <w:ind w:left="720"/>
+      </w:pPr>
+      <w:r>
+        <w:rPr>
+          <w:b/>
+          <w:bCs/>
+        </w:rPr>
+        <w:t>Attribute of future dimension table:</w:t>
+      </w:r>
+    </w:p>
+    <w:p>
+      <w:pPr>
+        <w:pStyle w:val="a2"/>
+        <w:ind w:left="720"/>
+      </w:pPr>
+      <w:r>
+        <w:tab/>
+      </w:r>
+      <w:proofErr w:type="spellStart"/>
+      <w:r>
+        <w:t>Employee_ID</w:t>
+      </w:r>
+      <w:proofErr w:type="spellEnd"/>
+    </w:p>
+    <w:p>
+      <w:pPr>
+        <w:pStyle w:val="a2"/>
+        <w:ind w:left="720"/>
+      </w:pPr>
+      <w:r>
+        <w:tab/>
+      </w:r>
+      <w:proofErr w:type="spellStart"/>
+      <w:r>
+        <w:t>First_Name</w:t>
+      </w:r>
+      <w:proofErr w:type="spellEnd"/>
+    </w:p>
+    <w:p>
+      <w:pPr>
+        <w:pStyle w:val="a2"/>
+        <w:ind w:left="720"/>
+      </w:pPr>
+      <w:r>
+        <w:tab/>
+      </w:r>
+      <w:proofErr w:type="spellStart"/>
+      <w:r>
+        <w:t>Last_name</w:t>
+      </w:r>
+      <w:proofErr w:type="spellEnd"/>
+    </w:p>
+    <w:p>
+      <w:pPr>
+        <w:pStyle w:val="a2"/>
+        <w:ind w:left="720"/>
+      </w:pPr>
+      <w:r>
+        <w:tab/>
+      </w:r>
+      <w:proofErr w:type="spellStart"/>
+      <w:r>
+        <w:t>Date_of_Birth</w:t>
+      </w:r>
+      <w:proofErr w:type="spellEnd"/>
+    </w:p>
+    <w:p>
+      <w:pPr>
+        <w:pStyle w:val="a2"/>
+        <w:ind w:left="720"/>
+      </w:pPr>
+      <w:r>
+        <w:tab/>
+      </w:r>
+      <w:proofErr w:type="spellStart"/>
+      <w:r>
+        <w:t>Personal_ID</w:t>
+      </w:r>
+      <w:proofErr w:type="spellEnd"/>
+    </w:p>
+    <w:p>
+      <w:pPr>
+        <w:pStyle w:val="a2"/>
+        <w:ind w:left="720"/>
+      </w:pPr>
+      <w:r>
+        <w:tab/>
+      </w:r>
+      <w:proofErr w:type="spellStart"/>
+      <w:r>
+        <w:t>Phone_number</w:t>
+      </w:r>
+      <w:proofErr w:type="spellEnd"/>
+    </w:p>
+    <w:p>
+      <w:pPr>
+        <w:pStyle w:val="a2"/>
+        <w:ind w:left="720"/>
+      </w:pPr>
+    </w:p>
+    <w:p>
+      <w:pPr>
+        <w:pStyle w:val="a2"/>
+      </w:pPr>
+      <w:r>
+        <w:t>Sales Information</w:t>
+      </w:r>
+      <w:r>
+        <w:t xml:space="preserve"> </w:t>
+      </w:r>
+      <w:r>
+        <w:t>(</w:t>
+      </w:r>
+      <w:r>
+        <w:t>Fact table)</w:t>
+      </w:r>
+      <w:r>
+        <w:t>:</w:t>
+      </w:r>
+    </w:p>
+    <w:p>
+      <w:pPr>
+        <w:pStyle w:val="a2"/>
+        <w:numPr>
+          <w:ilvl w:val="0"/>
+          <w:numId w:val="52"/>
+        </w:numPr>
+      </w:pPr>
+      <w:r>
+        <w:rPr>
+          <w:b/>
+          <w:bCs/>
+        </w:rPr>
+        <w:t>Order ID</w:t>
+      </w:r>
+      <w:proofErr w:type="gramStart"/>
+      <w:r>
+        <w:rPr>
+          <w:b/>
+          <w:bCs/>
+        </w:rPr>
+        <w:t>:</w:t>
+      </w:r>
+      <w:r>
+        <w:t xml:space="preserve"> </w:t>
+      </w:r>
+      <w:r>
+        <w:t xml:space="preserve"> </w:t>
+      </w:r>
+      <w:r>
+        <w:t>A</w:t>
+      </w:r>
+      <w:proofErr w:type="gramEnd"/>
+      <w:r>
+        <w:t xml:space="preserve"> unique identifier for each transaction (e.g., ORD-000001).</w:t>
+      </w:r>
+    </w:p>
+    <w:p>
+      <w:pPr>
+        <w:pStyle w:val="a2"/>
+        <w:numPr>
+          <w:ilvl w:val="0"/>
+          <w:numId w:val="52"/>
+        </w:numPr>
+      </w:pPr>
+      <w:r>
+        <w:rPr>
+          <w:b/>
+          <w:bCs/>
+        </w:rPr>
+        <w:t>Item Price:</w:t>
+      </w:r>
+      <w:r>
+        <w:t xml:space="preserve"> The base price of the product before any discounts (e.g., 42.0 for </w:t>
+      </w:r>
+      <w:proofErr w:type="spellStart"/>
+      <w:r>
+        <w:t>Aalopuri</w:t>
+      </w:r>
+      <w:proofErr w:type="spellEnd"/>
+      <w:r>
+        <w:t>, 9.0 for Cold Coffee).</w:t>
+      </w:r>
+    </w:p>
+    <w:p>
+      <w:pPr>
+        <w:pStyle w:val="a2"/>
+        <w:numPr>
+          <w:ilvl w:val="0"/>
+          <w:numId w:val="52"/>
+        </w:numPr>
+      </w:pPr>
+      <w:r>
+        <w:rPr>
+          <w:b/>
+          <w:bCs/>
+        </w:rPr>
+        <w:t>Quantity:</w:t>
+      </w:r>
+      <w:r>
+        <w:t xml:space="preserve"> The number of units of the product purchased in the transaction.</w:t>
+      </w:r>
+    </w:p>
+    <w:p>
+      <w:pPr>
+        <w:pStyle w:val="a2"/>
+        <w:numPr>
+          <w:ilvl w:val="0"/>
+          <w:numId w:val="52"/>
+        </w:numPr>
+      </w:pPr>
+      <w:r>
+        <w:rPr>
+          <w:b/>
+          <w:bCs/>
+        </w:rPr>
+        <w:t>Transaction Amount:</w:t>
+      </w:r>
+      <w:r>
+        <w:t xml:space="preserve"> The total amount paid by the customer after applying discounts, calculated as Item Price × Quantity - Discount.</w:t>
+      </w:r>
+    </w:p>
+    <w:p>
+      <w:pPr>
+        <w:pStyle w:val="a2"/>
+        <w:numPr>
+          <w:ilvl w:val="0"/>
+          <w:numId w:val="52"/>
+        </w:numPr>
+      </w:pPr>
+      <w:r>
+        <w:rPr>
+          <w:b/>
+          <w:bCs/>
+        </w:rPr>
+        <w:t>Transaction Type:</w:t>
+      </w:r>
+      <w:r>
+        <w:t xml:space="preserve"> The method of payment used (e.g., </w:t>
+      </w:r>
+      <w:r>
+        <w:rPr>
+          <w:i/>
+          <w:iCs/>
+        </w:rPr>
+        <w:t>Ca</w:t>
+      </w:r>
+      <w:r>
+        <w:rPr>
+          <w:i/>
+          <w:iCs/>
+        </w:rPr>
+        <w:t>sh</w:t>
+      </w:r>
+      <w:r>
+        <w:t>).</w:t>
+      </w:r>
+    </w:p>
+    <w:p>
+      <w:pPr>
+        <w:pStyle w:val="a2"/>
+      </w:pPr>
+    </w:p>
+    <w:p>
+      <w:pPr>
+        <w:pStyle w:val="a2"/>
+      </w:pPr>
+    </w:p>
+    <w:p>
+      <w:pPr>
+        <w:pStyle w:val="a2"/>
+      </w:pPr>
+      <w:r>
+        <w:t xml:space="preserve">The </w:t>
+      </w:r>
+      <w:r>
+        <w:t>second</w:t>
+      </w:r>
+      <w:r>
+        <w:t xml:space="preserve"> dataset </w:t>
+      </w:r>
+      <w:r>
+        <w:t>contains the following information</w:t>
+      </w:r>
+    </w:p>
+    <w:p>
+      <w:pPr>
+        <w:pStyle w:val="a2"/>
+      </w:pPr>
+      <w:proofErr w:type="spellStart"/>
+      <w:r>
+        <w:t>Fastfood</w:t>
+      </w:r>
+      <w:proofErr w:type="spellEnd"/>
+      <w:r>
+        <w:t xml:space="preserve"> Point </w:t>
+      </w:r>
+      <w:r>
+        <w:t>(Future dimension)</w:t>
+      </w:r>
+      <w:r>
+        <w:t>:</w:t>
+      </w:r>
+    </w:p>
+    <w:p>
+      <w:pPr>
+        <w:pStyle w:val="a2"/>
+        <w:numPr>
+          <w:ilvl w:val="0"/>
+          <w:numId w:val="46"/>
+        </w:numPr>
+      </w:pPr>
+      <w:r>
+        <w:rPr>
+          <w:b/>
+          <w:bCs/>
+        </w:rPr>
+        <w:t>Point Name:</w:t>
+      </w:r>
+      <w:r>
+        <w:t xml:space="preserve"> The name of the </w:t>
+      </w:r>
+      <w:proofErr w:type="gramStart"/>
+      <w:r>
+        <w:t>fast food</w:t>
+      </w:r>
+      <w:proofErr w:type="gramEnd"/>
+      <w:r>
+        <w:t xml:space="preserve"> outlet (e.g., Balaji_1, Balaji_2).</w:t>
+      </w:r>
+    </w:p>
+    <w:p>
+      <w:pPr>
+        <w:pStyle w:val="a2"/>
+        <w:numPr>
+          <w:ilvl w:val="0"/>
+          <w:numId w:val="46"/>
+        </w:numPr>
+      </w:pPr>
+      <w:r>
+        <w:rPr>
+          <w:b/>
+          <w:bCs/>
+        </w:rPr>
+        <w:t xml:space="preserve">Point </w:t>
+      </w:r>
+      <w:r>
+        <w:rPr>
+          <w:b/>
+          <w:bCs/>
+        </w:rPr>
+        <w:t>City:</w:t>
+      </w:r>
+      <w:r>
+        <w:t xml:space="preserve"> The city where the outlet is located (e.g., Atyrau, Almaty).</w:t>
+      </w:r>
+    </w:p>
+    <w:p>
+      <w:pPr>
+        <w:pStyle w:val="a2"/>
+        <w:numPr>
+          <w:ilvl w:val="0"/>
+          <w:numId w:val="46"/>
+        </w:numPr>
+      </w:pPr>
+      <w:r>
+        <w:rPr>
+          <w:b/>
+          <w:bCs/>
+        </w:rPr>
+        <w:t xml:space="preserve">Point </w:t>
+      </w:r>
+      <w:r>
+        <w:rPr>
+          <w:b/>
+          <w:bCs/>
+        </w:rPr>
+        <w:t>Address:</w:t>
+      </w:r>
+      <w:r>
+        <w:t xml:space="preserve"> The exact address of the outlet (e.g., </w:t>
+      </w:r>
+      <w:proofErr w:type="spellStart"/>
+      <w:r>
+        <w:t>Satpaeva</w:t>
+      </w:r>
+      <w:proofErr w:type="spellEnd"/>
+      <w:r>
+        <w:t xml:space="preserve"> 127, Abay 99).</w:t>
+      </w:r>
+    </w:p>
+    <w:p>
+      <w:pPr>
+        <w:pStyle w:val="a2"/>
+        <w:numPr>
+          <w:ilvl w:val="0"/>
+          <w:numId w:val="46"/>
+        </w:numPr>
+      </w:pPr>
+      <w:r>
+        <w:rPr>
+          <w:b/>
+          <w:bCs/>
+        </w:rPr>
+        <w:t xml:space="preserve">Point </w:t>
+      </w:r>
+      <w:r>
+        <w:rPr>
+          <w:b/>
+          <w:bCs/>
+        </w:rPr>
+        <w:t>Country:</w:t>
+      </w:r>
+      <w:r>
+        <w:t xml:space="preserve"> The country of operation (</w:t>
+      </w:r>
+      <w:r>
+        <w:rPr>
+          <w:i/>
+          <w:iCs/>
+        </w:rPr>
+        <w:t>Kazakhstan</w:t>
+      </w:r>
+      <w:r>
+        <w:t>).</w:t>
+      </w:r>
+    </w:p>
+    <w:p>
+      <w:pPr>
+        <w:pStyle w:val="a2"/>
+        <w:ind w:left="720"/>
+      </w:pPr>
+      <w:r>
+        <w:rPr>
+          <w:b/>
+          <w:bCs/>
+        </w:rPr>
+        <w:t>Attributes of future dimension table (hierarchy):</w:t>
+      </w:r>
+    </w:p>
+    <w:p>
+      <w:pPr>
+        <w:pStyle w:val="a2"/>
+        <w:ind w:left="720"/>
+      </w:pPr>
+      <w:r>
+        <w:tab/>
+        <w:t>Country (</w:t>
+      </w:r>
+      <w:proofErr w:type="spellStart"/>
+      <w:r>
+        <w:t>Country_ID</w:t>
+      </w:r>
+      <w:proofErr w:type="spellEnd"/>
+      <w:r>
+        <w:t xml:space="preserve">, </w:t>
+      </w:r>
+      <w:proofErr w:type="spellStart"/>
+      <w:r>
+        <w:t>country_name</w:t>
+      </w:r>
+      <w:proofErr w:type="spellEnd"/>
+      <w:r>
+        <w:t>)-&gt;</w:t>
+      </w:r>
+      <w:proofErr w:type="gramStart"/>
+      <w:r>
+        <w:t>City(</w:t>
+      </w:r>
+      <w:proofErr w:type="spellStart"/>
+      <w:proofErr w:type="gramEnd"/>
+      <w:r>
+        <w:t>City_ID</w:t>
+      </w:r>
+      <w:proofErr w:type="spellEnd"/>
+      <w:r>
+        <w:t xml:space="preserve">, </w:t>
+      </w:r>
+      <w:proofErr w:type="spellStart"/>
+      <w:r>
+        <w:t>City_name</w:t>
+      </w:r>
+      <w:proofErr w:type="spellEnd"/>
+      <w:r>
+        <w:t xml:space="preserve">, </w:t>
+      </w:r>
+      <w:proofErr w:type="spellStart"/>
+      <w:r>
+        <w:t>Country_ID</w:t>
+      </w:r>
+      <w:proofErr w:type="spellEnd"/>
+      <w:r>
+        <w:t>(FK))-&gt;Fast food point (</w:t>
+      </w:r>
+      <w:proofErr w:type="spellStart"/>
+      <w:r>
+        <w:t>Point_ID</w:t>
+      </w:r>
+      <w:proofErr w:type="spellEnd"/>
+      <w:r>
+        <w:t xml:space="preserve">, Address, </w:t>
+      </w:r>
+      <w:proofErr w:type="spellStart"/>
+      <w:r>
+        <w:t>City_ID</w:t>
+      </w:r>
+      <w:proofErr w:type="spellEnd"/>
+      <w:r>
+        <w:t>(FK))</w:t>
+      </w:r>
+    </w:p>
+    <w:p>
+      <w:pPr>
+        <w:pStyle w:val="a2"/>
+        <w:ind w:left="720"/>
+      </w:pPr>
+    </w:p>
+    <w:p>
+      <w:pPr>
+        <w:pStyle w:val="a2"/>
+      </w:pPr>
+      <w:r>
+        <w:t>Customer</w:t>
+      </w:r>
+      <w:r>
+        <w:t>s (Future dimension)</w:t>
+      </w:r>
+      <w:r>
+        <w:t>:</w:t>
+      </w:r>
+    </w:p>
+    <w:p>
+      <w:pPr>
+        <w:pStyle w:val="a2"/>
+        <w:numPr>
+          <w:ilvl w:val="0"/>
+          <w:numId w:val="47"/>
+        </w:numPr>
+      </w:pPr>
+      <w:r>
+        <w:rPr>
+          <w:b/>
+          <w:bCs/>
+        </w:rPr>
+        <w:t xml:space="preserve">Customer </w:t>
+      </w:r>
+      <w:r>
+        <w:rPr>
+          <w:b/>
+          <w:bCs/>
+        </w:rPr>
+        <w:t xml:space="preserve">First/Last </w:t>
+      </w:r>
+      <w:r>
+        <w:rPr>
+          <w:b/>
+          <w:bCs/>
+        </w:rPr>
+        <w:t>Name:</w:t>
+      </w:r>
+      <w:r>
+        <w:t xml:space="preserve"> The name of the customer (e.g., generated using Faker for anonymization).</w:t>
+      </w:r>
+    </w:p>
+    <w:p>
+      <w:pPr>
+        <w:pStyle w:val="a2"/>
+        <w:numPr>
+          <w:ilvl w:val="0"/>
+          <w:numId w:val="47"/>
+        </w:numPr>
+      </w:pPr>
+      <w:r>
+        <w:t>Customer Phone Number</w:t>
+      </w:r>
+    </w:p>
+    <w:p>
+      <w:pPr>
+        <w:pStyle w:val="a2"/>
+        <w:ind w:left="720"/>
+      </w:pPr>
+      <w:r>
+        <w:rPr>
+          <w:b/>
+          <w:bCs/>
+        </w:rPr>
+        <w:t>Attributes of future dimension table:</w:t>
+      </w:r>
+    </w:p>
+    <w:p>
+      <w:pPr>
+        <w:pStyle w:val="a2"/>
+        <w:ind w:left="720"/>
+      </w:pPr>
+      <w:r>
+        <w:tab/>
+      </w:r>
+      <w:proofErr w:type="spellStart"/>
+      <w:r>
+        <w:t>Cust_id</w:t>
+      </w:r>
+      <w:proofErr w:type="spellEnd"/>
+    </w:p>
+    <w:p>
+      <w:pPr>
+        <w:pStyle w:val="a2"/>
+        <w:ind w:left="720" w:firstLine="720"/>
+      </w:pPr>
+      <w:proofErr w:type="spellStart"/>
+      <w:r>
+        <w:t>First_name</w:t>
+      </w:r>
+      <w:proofErr w:type="spellEnd"/>
+    </w:p>
+    <w:p>
+      <w:pPr>
+        <w:pStyle w:val="a2"/>
+        <w:ind w:left="720" w:firstLine="720"/>
+      </w:pPr>
+      <w:proofErr w:type="spellStart"/>
+      <w:r>
+        <w:t>Last_name</w:t>
+      </w:r>
+      <w:proofErr w:type="spellEnd"/>
+      <w:r>
+        <w:br/>
+      </w:r>
+      <w:r>
+        <w:tab/>
+        <w:t>Phone number</w:t>
+      </w:r>
+    </w:p>
+    <w:p>
+      <w:pPr>
+        <w:pStyle w:val="a2"/>
+      </w:pPr>
+      <w:r>
+        <w:t>Discount</w:t>
+      </w:r>
+      <w:r>
+        <w:t xml:space="preserve"> (Future dimension)</w:t>
+      </w:r>
+      <w:r>
+        <w:t>:</w:t>
+      </w:r>
+    </w:p>
+    <w:p>
+      <w:pPr>
+        <w:pStyle w:val="a2"/>
+        <w:numPr>
+          <w:ilvl w:val="0"/>
+          <w:numId w:val="48"/>
         </w:numPr>
       </w:pPr>
       <w:r>
@@ -2466,282 +3395,14 @@
           <w:bCs/>
         </w:rPr>
         <w:lastRenderedPageBreak/>
-        <w:t>Employee:</w:t>
-      </w:r>
-      <w:r>
-        <w:t xml:space="preserve"> The name of the employee responsible for the transaction (e.g., Dan Yohan, Johan Maretti).</w:t>
-      </w:r>
-    </w:p>
-    <w:p>
-      <w:pPr>
-        <w:pStyle w:val="a2"/>
-        <w:ind w:left="720"/>
-      </w:pPr>
+        <w:t>Discoun</w:t>
+      </w:r>
       <w:r>
         <w:rPr>
           <w:b/>
           <w:bCs/>
         </w:rPr>
-        <w:t>Attribute of future dimension table:</w:t>
-      </w:r>
-    </w:p>
-    <w:p>
-      <w:pPr>
-        <w:pStyle w:val="a2"/>
-        <w:ind w:left="720"/>
-      </w:pPr>
-      <w:r>
-        <w:tab/>
-        <w:t>Employee_ID</w:t>
-      </w:r>
-    </w:p>
-    <w:p>
-      <w:pPr>
-        <w:pStyle w:val="a2"/>
-        <w:ind w:left="720"/>
-      </w:pPr>
-      <w:r>
-        <w:tab/>
-        <w:t>First_Name</w:t>
-      </w:r>
-    </w:p>
-    <w:p>
-      <w:pPr>
-        <w:pStyle w:val="a2"/>
-        <w:ind w:left="720"/>
-      </w:pPr>
-      <w:r>
-        <w:tab/>
-        <w:t>Last_name</w:t>
-      </w:r>
-    </w:p>
-    <w:p>
-      <w:pPr>
-        <w:pStyle w:val="a2"/>
-        <w:ind w:left="720"/>
-      </w:pPr>
-      <w:r>
-        <w:tab/>
-        <w:t>Date_of_Birth</w:t>
-      </w:r>
-    </w:p>
-    <w:p>
-      <w:pPr>
-        <w:pStyle w:val="a2"/>
-        <w:ind w:left="720"/>
-      </w:pPr>
-      <w:r>
-        <w:tab/>
-        <w:t>Personal_ID</w:t>
-      </w:r>
-    </w:p>
-    <w:p>
-      <w:pPr>
-        <w:pStyle w:val="a2"/>
-        <w:ind w:left="720"/>
-      </w:pPr>
-      <w:r>
-        <w:tab/>
-        <w:t>Phone_number</w:t>
-      </w:r>
-    </w:p>
-    <w:p>
-      <w:pPr>
-        <w:pStyle w:val="a2"/>
-        <w:ind w:left="720"/>
-      </w:pPr>
-    </w:p>
-    <w:p>
-      <w:pPr>
-        <w:pStyle w:val="a2"/>
-      </w:pPr>
-      <w:r>
-        <w:t>Sales Information</w:t>
-      </w:r>
-      <w:r>
-        <w:t xml:space="preserve"> </w:t>
-      </w:r>
-      <w:r>
-        <w:t>(</w:t>
-      </w:r>
-      <w:r>
-        <w:t>Fact table)</w:t>
-      </w:r>
-      <w:r>
-        <w:t>:</w:t>
-      </w:r>
-    </w:p>
-    <w:p>
-      <w:pPr>
-        <w:pStyle w:val="a2"/>
-        <w:numPr>
-          <w:ilvl w:val="0"/>
-          <w:numId w:val="52"/>
-        </w:numPr>
-      </w:pPr>
-      <w:r>
-        <w:rPr>
-          <w:b/>
-          <w:bCs/>
-        </w:rPr>
-        <w:t>Order ID:</w:t>
-      </w:r>
-      <w:r>
-        <w:t xml:space="preserve"> </w:t>
-      </w:r>
-      <w:r>
-        <w:t xml:space="preserve"> </w:t>
-      </w:r>
-      <w:r>
-        <w:t>A unique identifier for each transaction (e.g., ORD-000001).</w:t>
-      </w:r>
-    </w:p>
-    <w:p>
-      <w:pPr>
-        <w:pStyle w:val="a2"/>
-        <w:numPr>
-          <w:ilvl w:val="0"/>
-          <w:numId w:val="52"/>
-        </w:numPr>
-      </w:pPr>
-      <w:r>
-        <w:rPr>
-          <w:b/>
-          <w:bCs/>
-        </w:rPr>
-        <w:t>Item Price:</w:t>
-      </w:r>
-      <w:r>
-        <w:t xml:space="preserve"> The base price of the product before any discounts (e.g., 42.0 for Aalopuri, 9.0 for Cold Coffee).</w:t>
-      </w:r>
-    </w:p>
-    <w:p>
-      <w:pPr>
-        <w:pStyle w:val="a2"/>
-        <w:numPr>
-          <w:ilvl w:val="0"/>
-          <w:numId w:val="52"/>
-        </w:numPr>
-      </w:pPr>
-      <w:r>
-        <w:rPr>
-          <w:b/>
-          <w:bCs/>
-        </w:rPr>
-        <w:t>Quantity:</w:t>
-      </w:r>
-      <w:r>
-        <w:t xml:space="preserve"> The number of units of the product purchased in the transaction.</w:t>
-      </w:r>
-    </w:p>
-    <w:p>
-      <w:pPr>
-        <w:pStyle w:val="a2"/>
-        <w:numPr>
-          <w:ilvl w:val="0"/>
-          <w:numId w:val="52"/>
-        </w:numPr>
-      </w:pPr>
-      <w:r>
-        <w:rPr>
-          <w:b/>
-          <w:bCs/>
-        </w:rPr>
-        <w:t>Transaction Amount:</w:t>
-      </w:r>
-      <w:r>
-        <w:t xml:space="preserve"> The total amount paid by the customer after applying discounts, calculated as Item Price × Quantity - Discount.</w:t>
-      </w:r>
-    </w:p>
-    <w:p>
-      <w:pPr>
-        <w:pStyle w:val="a2"/>
-        <w:numPr>
-          <w:ilvl w:val="0"/>
-          <w:numId w:val="52"/>
-        </w:numPr>
-      </w:pPr>
-      <w:r>
-        <w:rPr>
-          <w:b/>
-          <w:bCs/>
-        </w:rPr>
-        <w:t>Transaction Type:</w:t>
-      </w:r>
-      <w:r>
-        <w:t xml:space="preserve"> The method of payment used (e.g., </w:t>
-      </w:r>
-      <w:r>
-        <w:rPr>
-          <w:i/>
-          <w:iCs/>
-        </w:rPr>
-        <w:t>Card</w:t>
-      </w:r>
-      <w:r>
-        <w:t>).</w:t>
-      </w:r>
-    </w:p>
-    <w:p>
-      <w:pPr>
-        <w:pStyle w:val="a2"/>
-      </w:pPr>
-    </w:p>
-    <w:p>
-      <w:pPr>
-        <w:pStyle w:val="a2"/>
-      </w:pPr>
-    </w:p>
-    <w:p>
-      <w:pPr>
-        <w:pStyle w:val="a2"/>
-      </w:pPr>
-      <w:r>
-        <w:t xml:space="preserve">The </w:t>
-      </w:r>
-      <w:r>
-        <w:t>second</w:t>
-      </w:r>
-      <w:r>
-        <w:t xml:space="preserve"> dataset </w:t>
-      </w:r>
-      <w:r>
-        <w:t>contains the following information</w:t>
-      </w:r>
-    </w:p>
-    <w:p>
-      <w:pPr>
-        <w:pStyle w:val="a2"/>
-      </w:pPr>
-      <w:proofErr w:type="spellStart"/>
-      <w:r>
-        <w:t>Fastfood</w:t>
-      </w:r>
-      <w:proofErr w:type="spellEnd"/>
-      <w:r>
-        <w:t xml:space="preserve"> Point </w:t>
-      </w:r>
-      <w:r>
-        <w:t>(Future dimension)</w:t>
-      </w:r>
-      <w:r>
-        <w:t>:</w:t>
-      </w:r>
-    </w:p>
-    <w:p>
-      <w:pPr>
-        <w:pStyle w:val="a2"/>
-        <w:numPr>
-          <w:ilvl w:val="0"/>
-          <w:numId w:val="46"/>
-        </w:numPr>
-      </w:pPr>
-      <w:r>
-        <w:rPr>
-          <w:b/>
-          <w:bCs/>
-        </w:rPr>
-        <w:t>Name of point</w:t>
+        <w:t>t%</w:t>
       </w:r>
       <w:r>
         <w:rPr>
@@ -2751,200 +3412,7 @@
         <w:t>:</w:t>
       </w:r>
       <w:r>
-        <w:t xml:space="preserve"> The name of the </w:t>
-      </w:r>
-      <w:proofErr w:type="gramStart"/>
-      <w:r>
-        <w:t>fast food</w:t>
-      </w:r>
-      <w:proofErr w:type="gramEnd"/>
-      <w:r>
-        <w:t xml:space="preserve"> outlet (e.g., Balaji_1, Balaji_2).</w:t>
-      </w:r>
-    </w:p>
-    <w:p>
-      <w:pPr>
-        <w:pStyle w:val="a2"/>
-        <w:numPr>
-          <w:ilvl w:val="0"/>
-          <w:numId w:val="46"/>
-        </w:numPr>
-      </w:pPr>
-      <w:r>
-        <w:rPr>
-          <w:b/>
-          <w:bCs/>
-        </w:rPr>
-        <w:t>City</w:t>
-      </w:r>
-      <w:r>
-        <w:rPr>
-          <w:b/>
-          <w:bCs/>
-        </w:rPr>
-        <w:t xml:space="preserve"> of point</w:t>
-      </w:r>
-      <w:r>
-        <w:rPr>
-          <w:b/>
-          <w:bCs/>
-        </w:rPr>
-        <w:t>:</w:t>
-      </w:r>
-      <w:r>
-        <w:t xml:space="preserve"> The city where the outlet is located (e.g., Atyrau, Almaty).</w:t>
-      </w:r>
-    </w:p>
-    <w:p>
-      <w:pPr>
-        <w:pStyle w:val="a2"/>
-        <w:numPr>
-          <w:ilvl w:val="0"/>
-          <w:numId w:val="46"/>
-        </w:numPr>
-      </w:pPr>
-      <w:r>
-        <w:rPr>
-          <w:b/>
-          <w:bCs/>
-        </w:rPr>
-        <w:t>Address</w:t>
-      </w:r>
-      <w:r>
-        <w:rPr>
-          <w:b/>
-          <w:bCs/>
-        </w:rPr>
-        <w:t xml:space="preserve"> of point</w:t>
-      </w:r>
-      <w:r>
-        <w:rPr>
-          <w:b/>
-          <w:bCs/>
-        </w:rPr>
-        <w:t>:</w:t>
-      </w:r>
-      <w:r>
-        <w:t xml:space="preserve"> The exact address of the outlet (e.g., Satpaeva 127, Abay 99).</w:t>
-      </w:r>
-    </w:p>
-    <w:p>
-      <w:pPr>
-        <w:pStyle w:val="a2"/>
-        <w:numPr>
-          <w:ilvl w:val="0"/>
-          <w:numId w:val="46"/>
-        </w:numPr>
-      </w:pPr>
-      <w:r>
-        <w:rPr>
-          <w:b/>
-          <w:bCs/>
-        </w:rPr>
-        <w:t>Country</w:t>
-      </w:r>
-      <w:r>
-        <w:rPr>
-          <w:b/>
-          <w:bCs/>
-        </w:rPr>
-        <w:t xml:space="preserve"> of point</w:t>
-      </w:r>
-      <w:r>
-        <w:rPr>
-          <w:b/>
-          <w:bCs/>
-        </w:rPr>
-        <w:t>:</w:t>
-      </w:r>
-      <w:r>
-        <w:t xml:space="preserve"> The country of operation (</w:t>
-      </w:r>
-      <w:r>
-        <w:rPr>
-          <w:i/>
-          <w:iCs/>
-        </w:rPr>
-        <w:t>Kazakhstan</w:t>
-      </w:r>
-      <w:r>
-        <w:t>).</w:t>
-      </w:r>
-    </w:p>
-    <w:p>
-      <w:pPr>
-        <w:pStyle w:val="a2"/>
-        <w:ind w:left="720"/>
-      </w:pPr>
-      <w:r>
-        <w:rPr>
-          <w:b/>
-          <w:bCs/>
-        </w:rPr>
-        <w:t>Attributes of future dimension table (hierarchy):</w:t>
-      </w:r>
-    </w:p>
-    <w:p>
-      <w:pPr>
-        <w:pStyle w:val="a2"/>
-        <w:ind w:left="720"/>
-      </w:pPr>
-      <w:r>
-        <w:tab/>
-        <w:t>Country (Country_ID, country_name)-&gt;City(City_ID, city_name, Country_ID(FK))-&gt;Fast food point (Point_ID, Address, City_ID(FK))</w:t>
-      </w:r>
-    </w:p>
-    <w:p>
-      <w:pPr>
-        <w:pStyle w:val="a2"/>
-        <w:ind w:left="720"/>
-      </w:pPr>
-    </w:p>
-    <w:p>
-      <w:pPr>
-        <w:pStyle w:val="a2"/>
-      </w:pPr>
-      <w:r>
-        <w:t>Customers</w:t>
-      </w:r>
-      <w:r>
-        <w:t xml:space="preserve"> (Future dimension)</w:t>
-      </w:r>
-      <w:r>
-        <w:t>:</w:t>
-      </w:r>
-    </w:p>
-    <w:p>
-      <w:pPr>
-        <w:pStyle w:val="a2"/>
-        <w:numPr>
-          <w:ilvl w:val="0"/>
-          <w:numId w:val="47"/>
-        </w:numPr>
-      </w:pPr>
-      <w:r>
-        <w:rPr>
-          <w:b/>
-          <w:bCs/>
-        </w:rPr>
-        <w:t>Customer</w:t>
-      </w:r>
-      <w:r>
-        <w:rPr>
-          <w:b/>
-          <w:bCs/>
-        </w:rPr>
-        <w:t xml:space="preserve"> of point</w:t>
-      </w:r>
-      <w:r>
-        <w:rPr>
-          <w:b/>
-          <w:bCs/>
-        </w:rPr>
-        <w:t>:</w:t>
-      </w:r>
-      <w:r>
-        <w:t xml:space="preserve"> The name of the customer (e.g., generated using Faker for anonymization).</w:t>
+        <w:t xml:space="preserve"> The percentage of discount applied to a transaction (e.g., 10%, 15%, 20%).</w:t>
       </w:r>
     </w:p>
     <w:p>
@@ -2967,40 +3435,49 @@
       </w:pPr>
       <w:r>
         <w:tab/>
-        <w:t>Cust_id</w:t>
-      </w:r>
-    </w:p>
-    <w:p>
-      <w:pPr>
-        <w:pStyle w:val="a2"/>
-        <w:ind w:left="720" w:firstLine="720"/>
-      </w:pPr>
-      <w:r>
-        <w:t>First_name</w:t>
-      </w:r>
-    </w:p>
-    <w:p>
-      <w:pPr>
-        <w:pStyle w:val="a2"/>
-        <w:ind w:left="720" w:firstLine="720"/>
-      </w:pPr>
-      <w:r>
-        <w:t>Last_name</w:t>
-      </w:r>
-      <w:r>
-        <w:br/>
-      </w:r>
+      </w:r>
+      <w:proofErr w:type="spellStart"/>
+      <w:r>
+        <w:t>Discount_ID</w:t>
+      </w:r>
+      <w:proofErr w:type="spellEnd"/>
+    </w:p>
+    <w:p>
+      <w:pPr>
+        <w:pStyle w:val="a2"/>
+        <w:ind w:left="720"/>
+      </w:pPr>
       <w:r>
         <w:tab/>
-        <w:t>Phone number</w:t>
-      </w:r>
-    </w:p>
-    <w:p>
-      <w:pPr>
-        <w:pStyle w:val="a2"/>
-      </w:pPr>
-      <w:r>
-        <w:t>Discount</w:t>
+      </w:r>
+      <w:proofErr w:type="spellStart"/>
+      <w:r>
+        <w:t>Date_of_discount</w:t>
+      </w:r>
+      <w:proofErr w:type="spellEnd"/>
+    </w:p>
+    <w:p>
+      <w:pPr>
+        <w:pStyle w:val="a2"/>
+        <w:ind w:left="720"/>
+      </w:pPr>
+      <w:r>
+        <w:tab/>
+        <w:t>Percentage</w:t>
+      </w:r>
+    </w:p>
+    <w:p>
+      <w:pPr>
+        <w:pStyle w:val="a2"/>
+        <w:ind w:left="720"/>
+      </w:pPr>
+    </w:p>
+    <w:p>
+      <w:pPr>
+        <w:pStyle w:val="a2"/>
+      </w:pPr>
+      <w:r>
+        <w:t>Product</w:t>
       </w:r>
       <w:r>
         <w:t xml:space="preserve"> (Future dimension)</w:t>
@@ -3014,7 +3491,7 @@
         <w:pStyle w:val="a2"/>
         <w:numPr>
           <w:ilvl w:val="0"/>
-          <w:numId w:val="48"/>
+          <w:numId w:val="49"/>
         </w:numPr>
       </w:pPr>
       <w:r>
@@ -3022,16 +3499,91 @@
           <w:b/>
           <w:bCs/>
         </w:rPr>
-        <w:t>Discount Percentage:</w:t>
-      </w:r>
-      <w:r>
-        <w:t xml:space="preserve"> The percentage of discount applied to a transaction (e.g., 10%, 15%, 20%).</w:t>
+        <w:t>Product</w:t>
+      </w:r>
+      <w:r>
+        <w:rPr>
+          <w:b/>
+          <w:bCs/>
+        </w:rPr>
+        <w:t xml:space="preserve"> Name:</w:t>
+      </w:r>
+      <w:r>
+        <w:t xml:space="preserve"> The name of the product sold (e.g., </w:t>
+      </w:r>
+      <w:proofErr w:type="spellStart"/>
+      <w:r>
+        <w:t>Aalopuri</w:t>
+      </w:r>
+      <w:proofErr w:type="spellEnd"/>
+      <w:r>
+        <w:t xml:space="preserve">, </w:t>
+      </w:r>
+      <w:proofErr w:type="spellStart"/>
+      <w:r>
+        <w:t>Panipuri</w:t>
+      </w:r>
+      <w:proofErr w:type="spellEnd"/>
+      <w:r>
+        <w:t>, Cold Coffee).</w:t>
+      </w:r>
+    </w:p>
+    <w:p>
+      <w:pPr>
+        <w:pStyle w:val="a2"/>
+        <w:numPr>
+          <w:ilvl w:val="0"/>
+          <w:numId w:val="49"/>
+        </w:numPr>
+      </w:pPr>
+      <w:r>
+        <w:rPr>
+          <w:b/>
+          <w:bCs/>
+        </w:rPr>
+        <w:t>Product</w:t>
+      </w:r>
+      <w:r>
+        <w:rPr>
+          <w:b/>
+          <w:bCs/>
+        </w:rPr>
+        <w:t xml:space="preserve"> Type:</w:t>
+      </w:r>
+      <w:r>
+        <w:t xml:space="preserve"> The category of the product, either </w:t>
+      </w:r>
+      <w:proofErr w:type="spellStart"/>
+      <w:r>
+        <w:rPr>
+          <w:i/>
+          <w:iCs/>
+        </w:rPr>
+        <w:t>Fastfood</w:t>
+      </w:r>
+      <w:proofErr w:type="spellEnd"/>
+      <w:r>
+        <w:t xml:space="preserve"> or </w:t>
+      </w:r>
+      <w:r>
+        <w:rPr>
+          <w:i/>
+          <w:iCs/>
+        </w:rPr>
+        <w:t>Beverages</w:t>
+      </w:r>
+      <w:r>
+        <w:t>.</w:t>
       </w:r>
     </w:p>
     <w:p>
       <w:pPr>
         <w:pStyle w:val="a2"/>
         <w:ind w:left="720"/>
+        <w:rPr>
+          <w:b/>
+          <w:bCs/>
+        </w:rPr>
       </w:pPr>
       <w:r>
         <w:rPr>
@@ -3047,158 +3599,18 @@
         <w:ind w:left="720"/>
       </w:pPr>
       <w:r>
-        <w:tab/>
-        <w:t>Discount_ID</w:t>
-      </w:r>
-    </w:p>
-    <w:p>
-      <w:pPr>
-        <w:pStyle w:val="a2"/>
-        <w:ind w:left="720"/>
-      </w:pPr>
-      <w:r>
-        <w:lastRenderedPageBreak/>
-        <w:tab/>
-        <w:t>Date_of_discount</w:t>
-      </w:r>
-    </w:p>
-    <w:p>
-      <w:pPr>
-        <w:pStyle w:val="a2"/>
-        <w:ind w:left="720"/>
-      </w:pPr>
-      <w:r>
-        <w:tab/>
-        <w:t>Percentage</w:t>
-      </w:r>
-    </w:p>
-    <w:p>
-      <w:pPr>
-        <w:pStyle w:val="a2"/>
-        <w:ind w:left="720"/>
-      </w:pPr>
-    </w:p>
-    <w:p>
-      <w:pPr>
-        <w:pStyle w:val="a2"/>
-      </w:pPr>
-      <w:r>
-        <w:t>Product</w:t>
-      </w:r>
-      <w:r>
-        <w:t xml:space="preserve"> (Future dimension)</w:t>
-      </w:r>
-      <w:r>
-        <w:t>:</w:t>
-      </w:r>
-    </w:p>
-    <w:p>
-      <w:pPr>
-        <w:pStyle w:val="a2"/>
-        <w:numPr>
-          <w:ilvl w:val="0"/>
-          <w:numId w:val="49"/>
-        </w:numPr>
-      </w:pPr>
-      <w:r>
-        <w:rPr>
-          <w:b/>
-          <w:bCs/>
-        </w:rPr>
-        <w:t>Product</w:t>
-      </w:r>
-      <w:r>
-        <w:rPr>
-          <w:b/>
-          <w:bCs/>
-        </w:rPr>
-        <w:t xml:space="preserve"> Name:</w:t>
-      </w:r>
-      <w:r>
-        <w:t xml:space="preserve"> The name of the product sold (e.g., Aalopuri, Panipuri, Cold Coffee).</w:t>
-      </w:r>
-    </w:p>
-    <w:p>
-      <w:pPr>
-        <w:pStyle w:val="a2"/>
-        <w:numPr>
-          <w:ilvl w:val="0"/>
-          <w:numId w:val="49"/>
-        </w:numPr>
-      </w:pPr>
-      <w:r>
-        <w:rPr>
-          <w:b/>
-          <w:bCs/>
-        </w:rPr>
-        <w:t>Product</w:t>
-      </w:r>
-      <w:r>
-        <w:rPr>
-          <w:b/>
-          <w:bCs/>
-        </w:rPr>
-        <w:t xml:space="preserve"> </w:t>
-      </w:r>
-      <w:r>
-        <w:rPr>
-          <w:b/>
-          <w:bCs/>
-        </w:rPr>
-        <w:t>Type:</w:t>
-      </w:r>
-      <w:r>
-        <w:t xml:space="preserve"> The category of the product, either </w:t>
-      </w:r>
-      <w:r>
-        <w:rPr>
-          <w:i/>
-          <w:iCs/>
-        </w:rPr>
-        <w:t>Fastfood</w:t>
-      </w:r>
-      <w:r>
-        <w:t xml:space="preserve"> or </w:t>
-      </w:r>
-      <w:r>
-        <w:rPr>
-          <w:i/>
-          <w:iCs/>
-        </w:rPr>
-        <w:t>Beverages</w:t>
-      </w:r>
-      <w:r>
-        <w:t>.</w:t>
-      </w:r>
-    </w:p>
-    <w:p>
-      <w:pPr>
-        <w:pStyle w:val="a2"/>
-        <w:ind w:left="720"/>
-        <w:rPr>
-          <w:b/>
-          <w:bCs/>
-        </w:rPr>
-      </w:pPr>
-      <w:r>
-        <w:rPr>
-          <w:b/>
-          <w:bCs/>
-        </w:rPr>
-        <w:t>Attributes of future dimension table:</w:t>
-      </w:r>
-    </w:p>
-    <w:p>
-      <w:pPr>
-        <w:pStyle w:val="a2"/>
-        <w:ind w:left="720"/>
-      </w:pPr>
-      <w:r>
         <w:rPr>
           <w:b/>
           <w:bCs/>
         </w:rPr>
         <w:tab/>
+      </w:r>
+      <w:proofErr w:type="gramStart"/>
+      <w:r>
+        <w:rPr>
+          <w:b/>
+          <w:bCs/>
+        </w:rPr>
         <w:t>Category</w:t>
       </w:r>
       <w:r>
@@ -3214,7 +3626,15 @@
           <w:bCs/>
         </w:rPr>
         <w:tab/>
-        <w:t>-&gt;</w:t>
+        <w:t>-</w:t>
+      </w:r>
+      <w:proofErr w:type="gramEnd"/>
+      <w:r>
+        <w:rPr>
+          <w:b/>
+          <w:bCs/>
+        </w:rPr>
+        <w:t>&gt;</w:t>
       </w:r>
       <w:r>
         <w:rPr>
@@ -3230,9 +3650,11 @@
         <w:pStyle w:val="a2"/>
         <w:ind w:left="720" w:firstLine="720"/>
       </w:pPr>
+      <w:proofErr w:type="spellStart"/>
       <w:r>
         <w:t>Category_ID</w:t>
       </w:r>
+      <w:proofErr w:type="spellEnd"/>
       <w:r>
         <w:tab/>
       </w:r>
@@ -3241,8 +3663,12 @@
       </w:r>
       <w:r>
         <w:tab/>
+      </w:r>
+      <w:proofErr w:type="spellStart"/>
+      <w:r>
         <w:t>Prod_ID</w:t>
       </w:r>
+      <w:proofErr w:type="spellEnd"/>
     </w:p>
     <w:p>
       <w:pPr>
@@ -3251,8 +3677,12 @@
       </w:pPr>
       <w:r>
         <w:tab/>
+      </w:r>
+      <w:proofErr w:type="spellStart"/>
+      <w:r>
         <w:t>Category_name</w:t>
       </w:r>
+      <w:proofErr w:type="spellEnd"/>
       <w:r>
         <w:tab/>
       </w:r>
@@ -3283,8 +3713,41 @@
       </w:r>
       <w:r>
         <w:tab/>
-        <w:t>Category_ID (FK)</w:t>
-      </w:r>
+      </w:r>
+      <w:proofErr w:type="spellStart"/>
+      <w:r>
+        <w:t>Category_ID</w:t>
+      </w:r>
+      <w:proofErr w:type="spellEnd"/>
+      <w:r>
+        <w:t xml:space="preserve"> (FK)</w:t>
+      </w:r>
+    </w:p>
+    <w:p>
+      <w:pPr>
+        <w:pStyle w:val="a2"/>
+        <w:ind w:left="720"/>
+      </w:pPr>
+      <w:r>
+        <w:tab/>
+      </w:r>
+      <w:r>
+        <w:tab/>
+      </w:r>
+      <w:r>
+        <w:tab/>
+      </w:r>
+      <w:r>
+        <w:tab/>
+      </w:r>
+      <w:r>
+        <w:tab/>
+      </w:r>
+      <w:proofErr w:type="spellStart"/>
+      <w:r>
+        <w:t>Prod_price</w:t>
+      </w:r>
+      <w:proofErr w:type="spellEnd"/>
     </w:p>
     <w:p>
       <w:pPr>
@@ -3319,7 +3782,14 @@
           <w:b/>
           <w:bCs/>
         </w:rPr>
-        <w:t>Order Date:</w:t>
+        <w:t xml:space="preserve">Order </w:t>
+      </w:r>
+      <w:r>
+        <w:rPr>
+          <w:b/>
+          <w:bCs/>
+        </w:rPr>
+        <w:t>Date:</w:t>
       </w:r>
       <w:r>
         <w:t xml:space="preserve"> The date when the transaction occurred, ranging from January 22, 2024, to January 23, 2025.</w:t>
@@ -3355,8 +3825,12 @@
       </w:pPr>
       <w:r>
         <w:tab/>
+      </w:r>
+      <w:proofErr w:type="spellStart"/>
+      <w:r>
         <w:t>Day_of_week</w:t>
       </w:r>
+      <w:proofErr w:type="spellEnd"/>
     </w:p>
     <w:p>
       <w:pPr>
@@ -3437,24 +3911,36 @@
           <w:b/>
           <w:bCs/>
         </w:rPr>
-        <w:t>Employee</w:t>
-      </w:r>
-      <w:r>
-        <w:rPr>
-          <w:b/>
-          <w:bCs/>
-        </w:rPr>
-        <w:t xml:space="preserve"> of point</w:t>
-      </w:r>
-      <w:r>
-        <w:rPr>
-          <w:b/>
-          <w:bCs/>
-        </w:rPr>
-        <w:t>:</w:t>
-      </w:r>
-      <w:r>
-        <w:t xml:space="preserve"> The name of the employee responsible for the transaction (e.g., Dan Yohan, Johan Maretti).</w:t>
+        <w:t>Employee:</w:t>
+      </w:r>
+      <w:r>
+        <w:t xml:space="preserve"> The name of the employee responsible for the transaction (e.g., </w:t>
+      </w:r>
+      <w:r>
+        <w:t>Alex</w:t>
+      </w:r>
+      <w:r>
+        <w:t xml:space="preserve"> </w:t>
+      </w:r>
+      <w:r>
+        <w:t>Ivanov</w:t>
+      </w:r>
+      <w:r>
+        <w:t xml:space="preserve">, </w:t>
+      </w:r>
+      <w:proofErr w:type="gramStart"/>
+      <w:r>
+        <w:t xml:space="preserve">Maria </w:t>
+      </w:r>
+      <w:r>
+        <w:t xml:space="preserve"> </w:t>
+      </w:r>
+      <w:r>
+        <w:t>Petrova</w:t>
+      </w:r>
+      <w:proofErr w:type="gramEnd"/>
+      <w:r>
+        <w:t>).</w:t>
       </w:r>
     </w:p>
     <w:p>
@@ -3477,8 +3963,12 @@
       </w:pPr>
       <w:r>
         <w:tab/>
+      </w:r>
+      <w:proofErr w:type="spellStart"/>
+      <w:r>
         <w:t>Employee_ID</w:t>
       </w:r>
+      <w:proofErr w:type="spellEnd"/>
     </w:p>
     <w:p>
       <w:pPr>
@@ -3487,8 +3977,12 @@
       </w:pPr>
       <w:r>
         <w:tab/>
+      </w:r>
+      <w:proofErr w:type="spellStart"/>
+      <w:r>
         <w:t>First_Name</w:t>
       </w:r>
+      <w:proofErr w:type="spellEnd"/>
     </w:p>
     <w:p>
       <w:pPr>
@@ -3497,8 +3991,12 @@
       </w:pPr>
       <w:r>
         <w:tab/>
+      </w:r>
+      <w:proofErr w:type="spellStart"/>
+      <w:r>
         <w:t>Last_name</w:t>
       </w:r>
+      <w:proofErr w:type="spellEnd"/>
     </w:p>
     <w:p>
       <w:pPr>
@@ -3507,8 +4005,12 @@
       </w:pPr>
       <w:r>
         <w:tab/>
+      </w:r>
+      <w:proofErr w:type="spellStart"/>
+      <w:r>
         <w:t>Date_of_Birth</w:t>
       </w:r>
+      <w:proofErr w:type="spellEnd"/>
     </w:p>
     <w:p>
       <w:pPr>
@@ -3517,8 +4019,12 @@
       </w:pPr>
       <w:r>
         <w:tab/>
+      </w:r>
+      <w:proofErr w:type="spellStart"/>
+      <w:r>
         <w:t>Personal_ID</w:t>
       </w:r>
+      <w:proofErr w:type="spellEnd"/>
     </w:p>
     <w:p>
       <w:pPr>
@@ -3527,14 +4033,81 @@
       </w:pPr>
       <w:r>
         <w:tab/>
+      </w:r>
+      <w:proofErr w:type="spellStart"/>
+      <w:r>
         <w:t>Phone_number</w:t>
       </w:r>
-    </w:p>
-    <w:p>
-      <w:pPr>
-        <w:pStyle w:val="a2"/>
-        <w:ind w:left="720"/>
-      </w:pPr>
+      <w:proofErr w:type="spellEnd"/>
+    </w:p>
+    <w:p>
+      <w:pPr>
+        <w:pStyle w:val="a2"/>
+      </w:pPr>
+    </w:p>
+    <w:p>
+      <w:pPr>
+        <w:pStyle w:val="a2"/>
+      </w:pPr>
+    </w:p>
+    <w:p>
+      <w:pPr>
+        <w:pStyle w:val="a2"/>
+      </w:pPr>
+    </w:p>
+    <w:p>
+      <w:pPr>
+        <w:pStyle w:val="a2"/>
+      </w:pPr>
+      <w:r>
+        <w:lastRenderedPageBreak/>
+        <w:t>Card Information (Future Dimension):</w:t>
+      </w:r>
+    </w:p>
+    <w:p>
+      <w:pPr>
+        <w:pStyle w:val="a2"/>
+        <w:numPr>
+          <w:ilvl w:val="0"/>
+          <w:numId w:val="55"/>
+        </w:numPr>
+      </w:pPr>
+      <w:r>
+        <w:t xml:space="preserve">Bank of Card: </w:t>
+      </w:r>
+      <w:r>
+        <w:t>The bank to which the card belongs</w:t>
+      </w:r>
+      <w:r>
+        <w:t xml:space="preserve"> </w:t>
+      </w:r>
+      <w:r>
+        <w:t xml:space="preserve">(e.g., </w:t>
+      </w:r>
+      <w:r>
+        <w:t>Kaspi</w:t>
+      </w:r>
+      <w:r>
+        <w:t>,</w:t>
+      </w:r>
+      <w:r>
+        <w:t xml:space="preserve"> Halyk Bank</w:t>
+      </w:r>
+      <w:r>
+        <w:t>).</w:t>
+      </w:r>
+    </w:p>
+    <w:p>
+      <w:pPr>
+        <w:pStyle w:val="a2"/>
+        <w:numPr>
+          <w:ilvl w:val="0"/>
+          <w:numId w:val="55"/>
+        </w:numPr>
+      </w:pPr>
+      <w:r>
+        <w:t>Card Type: e.g. Visa, Mastercard</w:t>
+      </w:r>
     </w:p>
     <w:p>
       <w:pPr>
@@ -3564,13 +4137,6 @@
           <w:numId w:val="52"/>
         </w:numPr>
       </w:pPr>
-      <w:r>
-        <w:rPr>
-          <w:b/>
-          <w:bCs/>
-        </w:rPr>
-        <w:t xml:space="preserve">Card </w:t>
-      </w:r>
       <w:r>
         <w:rPr>
           <w:b/>
@@ -3579,13 +4145,7 @@
         <w:t>Order ID:</w:t>
       </w:r>
       <w:r>
-        <w:t xml:space="preserve"> </w:t>
-      </w:r>
-      <w:r>
-        <w:t xml:space="preserve"> </w:t>
-      </w:r>
-      <w:r>
-        <w:t xml:space="preserve">A unique identifier for each transaction (e.g., </w:t>
+        <w:t xml:space="preserve"> A unique identifier for each transaction (e.g., </w:t>
       </w:r>
       <w:r>
         <w:t>Card</w:t>
@@ -3607,102 +4167,37 @@
           <w:b/>
           <w:bCs/>
         </w:rPr>
-        <w:t>Product</w:t>
-      </w:r>
+        <w:t>Item Price:</w:t>
+      </w:r>
+      <w:r>
+        <w:t xml:space="preserve"> The base price of the product before any discounts (e.g., 42.0 for </w:t>
+      </w:r>
+      <w:proofErr w:type="spellStart"/>
+      <w:r>
+        <w:t>Aalopuri</w:t>
+      </w:r>
+      <w:proofErr w:type="spellEnd"/>
+      <w:r>
+        <w:t>, 9.0 for Cold Coffee).</w:t>
+      </w:r>
+    </w:p>
+    <w:p>
+      <w:pPr>
+        <w:pStyle w:val="a2"/>
+        <w:numPr>
+          <w:ilvl w:val="0"/>
+          <w:numId w:val="52"/>
+        </w:numPr>
+      </w:pPr>
       <w:r>
         <w:rPr>
           <w:b/>
           <w:bCs/>
         </w:rPr>
-        <w:t xml:space="preserve"> Price:</w:t>
-      </w:r>
-      <w:r>
-        <w:t xml:space="preserve"> The base price of the product before any discounts (e.g., 42.0 for Aalopuri, 9.0 for Cold Coffee).</w:t>
-      </w:r>
-    </w:p>
-    <w:p>
-      <w:pPr>
-        <w:pStyle w:val="a2"/>
-        <w:numPr>
-          <w:ilvl w:val="0"/>
-          <w:numId w:val="52"/>
-        </w:numPr>
-      </w:pPr>
-      <w:r>
-        <w:rPr>
-          <w:b/>
-          <w:bCs/>
-        </w:rPr>
-        <w:t>Quantity</w:t>
-      </w:r>
-      <w:r>
-        <w:rPr>
-          <w:b/>
-          <w:bCs/>
-        </w:rPr>
-        <w:t xml:space="preserve"> sold</w:t>
-      </w:r>
-      <w:r>
-        <w:rPr>
-          <w:b/>
-          <w:bCs/>
-        </w:rPr>
-        <w:t>:</w:t>
+        <w:t>Quantity:</w:t>
       </w:r>
       <w:r>
         <w:t xml:space="preserve"> The number of units of the product purchased in the transaction.</w:t>
-      </w:r>
-    </w:p>
-    <w:p>
-      <w:pPr>
-        <w:pStyle w:val="a2"/>
-        <w:numPr>
-          <w:ilvl w:val="0"/>
-          <w:numId w:val="52"/>
-        </w:numPr>
-      </w:pPr>
-      <w:r>
-        <w:rPr>
-          <w:b/>
-          <w:bCs/>
-        </w:rPr>
-        <w:lastRenderedPageBreak/>
-        <w:t xml:space="preserve">Payment </w:t>
-      </w:r>
-      <w:r>
-        <w:rPr>
-          <w:b/>
-          <w:bCs/>
-        </w:rPr>
-        <w:t>Amount</w:t>
-      </w:r>
-      <w:r>
-        <w:rPr>
-          <w:b/>
-          <w:bCs/>
-        </w:rPr>
-        <w:t>:</w:t>
-      </w:r>
-      <w:r>
-        <w:t xml:space="preserve"> The total amount paid by the customer after applying discounts, calculated as </w:t>
-      </w:r>
-      <w:r>
-        <w:t>Product</w:t>
-      </w:r>
-      <w:r>
-        <w:t xml:space="preserve"> Price × Quantity</w:t>
-      </w:r>
-      <w:r>
-        <w:t xml:space="preserve"> sold</w:t>
-      </w:r>
-      <w:r>
-        <w:t xml:space="preserve"> </w:t>
-      </w:r>
-      <w:r>
-        <w:t>–</w:t>
-      </w:r>
-      <w:r>
-        <w:t xml:space="preserve"> Discount.</w:t>
       </w:r>
     </w:p>
     <w:p>
@@ -3725,10 +4220,92 @@
           <w:b/>
           <w:bCs/>
         </w:rPr>
+        <w:t xml:space="preserve"> Amount:</w:t>
+      </w:r>
+      <w:r>
+        <w:t xml:space="preserve"> The total amount paid by the customer after applying discounts, calculated as Item Price × Quantity - Discount.</w:t>
+      </w:r>
+    </w:p>
+    <w:p>
+      <w:pPr>
+        <w:pStyle w:val="a2"/>
+        <w:numPr>
+          <w:ilvl w:val="0"/>
+          <w:numId w:val="52"/>
+        </w:numPr>
+      </w:pPr>
+      <w:r>
+        <w:rPr>
+          <w:b/>
+          <w:bCs/>
+        </w:rPr>
+        <w:t>Payment</w:t>
+      </w:r>
+      <w:r>
+        <w:rPr>
+          <w:b/>
+          <w:bCs/>
+        </w:rPr>
         <w:t xml:space="preserve"> Type:</w:t>
       </w:r>
       <w:r>
         <w:t xml:space="preserve"> The method of payment used (e.g., </w:t>
+      </w:r>
+      <w:r>
+        <w:rPr>
+          <w:i/>
+          <w:iCs/>
+        </w:rPr>
+        <w:t>Card</w:t>
+      </w:r>
+      <w:r>
+        <w:t>).</w:t>
+      </w:r>
+    </w:p>
+    <w:p>
+      <w:pPr>
+        <w:pStyle w:val="a2"/>
+      </w:pPr>
+    </w:p>
+    <w:p>
+      <w:pPr>
+        <w:pStyle w:val="a2"/>
+      </w:pPr>
+      <w:r>
+        <w:t>The main differences between the two datasets are as follows:</w:t>
+      </w:r>
+    </w:p>
+    <w:p>
+      <w:pPr>
+        <w:pStyle w:val="a2"/>
+        <w:numPr>
+          <w:ilvl w:val="0"/>
+          <w:numId w:val="54"/>
+        </w:numPr>
+      </w:pPr>
+      <w:r>
+        <w:t xml:space="preserve">The first dataset focuses on </w:t>
+      </w:r>
+      <w:r>
+        <w:rPr>
+          <w:b/>
+          <w:bCs/>
+        </w:rPr>
+        <w:t>cash payments</w:t>
+      </w:r>
+      <w:r>
+        <w:t xml:space="preserve">, with </w:t>
+      </w:r>
+      <w:proofErr w:type="spellStart"/>
+      <w:r>
+        <w:t>payment</w:t>
+      </w:r>
+      <w:r>
+        <w:t>_type</w:t>
+      </w:r>
+      <w:proofErr w:type="spellEnd"/>
+      <w:r>
+        <w:t xml:space="preserve"> set to </w:t>
       </w:r>
       <w:r>
         <w:rPr>
@@ -3738,20 +4315,7 @@
         <w:t>Cash</w:t>
       </w:r>
       <w:r>
-        <w:t>).</w:t>
-      </w:r>
-    </w:p>
-    <w:p>
-      <w:pPr>
-        <w:pStyle w:val="a2"/>
-      </w:pPr>
-    </w:p>
-    <w:p>
-      <w:pPr>
-        <w:pStyle w:val="a2"/>
-      </w:pPr>
-      <w:r>
-        <w:t>The main differences between the two datasets are as follows:</w:t>
+        <w:t>.</w:t>
       </w:r>
     </w:p>
     <w:p>
@@ -3759,62 +4323,6 @@
         <w:pStyle w:val="a2"/>
         <w:numPr>
           <w:ilvl w:val="0"/>
-          <w:numId w:val="54"/>
-        </w:numPr>
-      </w:pPr>
-      <w:r>
-        <w:rPr>
-          <w:b/>
-          <w:bCs/>
-        </w:rPr>
-        <w:t>Dataset Names and Payment Types:</w:t>
-      </w:r>
-    </w:p>
-    <w:p>
-      <w:pPr>
-        <w:pStyle w:val="a2"/>
-        <w:numPr>
-          <w:ilvl w:val="1"/>
-          <w:numId w:val="54"/>
-        </w:numPr>
-      </w:pPr>
-      <w:r>
-        <w:t xml:space="preserve">The first dataset focuses on </w:t>
-      </w:r>
-      <w:r>
-        <w:rPr>
-          <w:b/>
-          <w:bCs/>
-        </w:rPr>
-        <w:t>cash payments</w:t>
-      </w:r>
-      <w:r>
-        <w:t xml:space="preserve">, with </w:t>
-      </w:r>
-      <w:proofErr w:type="spellStart"/>
-      <w:r>
-        <w:t>transaction_type</w:t>
-      </w:r>
-      <w:proofErr w:type="spellEnd"/>
-      <w:r>
-        <w:t xml:space="preserve"> set to </w:t>
-      </w:r>
-      <w:r>
-        <w:rPr>
-          <w:i/>
-          <w:iCs/>
-        </w:rPr>
-        <w:t>Cash</w:t>
-      </w:r>
-      <w:r>
-        <w:t>.</w:t>
-      </w:r>
-    </w:p>
-    <w:p>
-      <w:pPr>
-        <w:pStyle w:val="a2"/>
-        <w:numPr>
-          <w:ilvl w:val="1"/>
           <w:numId w:val="54"/>
         </w:numPr>
       </w:pPr>
@@ -3847,483 +4355,13 @@
         <w:t>Card</w:t>
       </w:r>
       <w:r>
+        <w:t xml:space="preserve"> and </w:t>
+      </w:r>
+      <w:r>
+        <w:t>contains card information entity</w:t>
+      </w:r>
+      <w:r>
         <w:t>.</w:t>
-      </w:r>
-    </w:p>
-    <w:p>
-      <w:pPr>
-        <w:pStyle w:val="a2"/>
-        <w:numPr>
-          <w:ilvl w:val="0"/>
-          <w:numId w:val="54"/>
-        </w:numPr>
-      </w:pPr>
-      <w:r>
-        <w:rPr>
-          <w:b/>
-          <w:bCs/>
-        </w:rPr>
-        <w:t>Attribute Names:</w:t>
-      </w:r>
-    </w:p>
-    <w:p>
-      <w:pPr>
-        <w:pStyle w:val="a2"/>
-        <w:numPr>
-          <w:ilvl w:val="1"/>
-          <w:numId w:val="54"/>
-        </w:numPr>
-      </w:pPr>
-      <w:r>
-        <w:rPr>
-          <w:b/>
-          <w:bCs/>
-        </w:rPr>
-        <w:t>Order Identifier:</w:t>
-      </w:r>
-    </w:p>
-    <w:p>
-      <w:pPr>
-        <w:pStyle w:val="a2"/>
-        <w:numPr>
-          <w:ilvl w:val="2"/>
-          <w:numId w:val="54"/>
-        </w:numPr>
-      </w:pPr>
-      <w:r>
-        <w:t xml:space="preserve">The first dataset uses </w:t>
-      </w:r>
-      <w:proofErr w:type="spellStart"/>
-      <w:r>
-        <w:t>order_id</w:t>
-      </w:r>
-      <w:proofErr w:type="spellEnd"/>
-      <w:r>
-        <w:t xml:space="preserve"> to identify orders.</w:t>
-      </w:r>
-    </w:p>
-    <w:p>
-      <w:pPr>
-        <w:pStyle w:val="a2"/>
-        <w:numPr>
-          <w:ilvl w:val="2"/>
-          <w:numId w:val="54"/>
-        </w:numPr>
-      </w:pPr>
-      <w:r>
-        <w:t xml:space="preserve">The second dataset uses </w:t>
-      </w:r>
-      <w:proofErr w:type="spellStart"/>
-      <w:r>
-        <w:t>card_order_id</w:t>
-      </w:r>
-      <w:proofErr w:type="spellEnd"/>
-      <w:r>
-        <w:t xml:space="preserve"> for the same purpose.</w:t>
-      </w:r>
-    </w:p>
-    <w:p>
-      <w:pPr>
-        <w:pStyle w:val="a2"/>
-        <w:numPr>
-          <w:ilvl w:val="1"/>
-          <w:numId w:val="54"/>
-        </w:numPr>
-      </w:pPr>
-      <w:r>
-        <w:rPr>
-          <w:b/>
-          <w:bCs/>
-        </w:rPr>
-        <w:t>Product Information:</w:t>
-      </w:r>
-    </w:p>
-    <w:p>
-      <w:pPr>
-        <w:pStyle w:val="a2"/>
-        <w:numPr>
-          <w:ilvl w:val="2"/>
-          <w:numId w:val="54"/>
-        </w:numPr>
-      </w:pPr>
-      <w:r>
-        <w:t xml:space="preserve">The first dataset uses </w:t>
-      </w:r>
-      <w:proofErr w:type="spellStart"/>
-      <w:r>
-        <w:t>item_name</w:t>
-      </w:r>
-      <w:proofErr w:type="spellEnd"/>
-      <w:r>
-        <w:t xml:space="preserve">, </w:t>
-      </w:r>
-      <w:proofErr w:type="spellStart"/>
-      <w:r>
-        <w:t>item_type</w:t>
-      </w:r>
-      <w:proofErr w:type="spellEnd"/>
-      <w:r>
-        <w:t xml:space="preserve">, and </w:t>
-      </w:r>
-      <w:proofErr w:type="spellStart"/>
-      <w:r>
-        <w:t>item_price</w:t>
-      </w:r>
-      <w:proofErr w:type="spellEnd"/>
-      <w:r>
-        <w:t>.</w:t>
-      </w:r>
-    </w:p>
-    <w:p>
-      <w:pPr>
-        <w:pStyle w:val="a2"/>
-        <w:numPr>
-          <w:ilvl w:val="2"/>
-          <w:numId w:val="54"/>
-        </w:numPr>
-      </w:pPr>
-      <w:r>
-        <w:t xml:space="preserve">The second dataset uses </w:t>
-      </w:r>
-      <w:proofErr w:type="spellStart"/>
-      <w:r>
-        <w:t>product_name</w:t>
-      </w:r>
-      <w:proofErr w:type="spellEnd"/>
-      <w:r>
-        <w:t xml:space="preserve">, </w:t>
-      </w:r>
-      <w:proofErr w:type="spellStart"/>
-      <w:r>
-        <w:t>product_type</w:t>
-      </w:r>
-      <w:proofErr w:type="spellEnd"/>
-      <w:r>
-        <w:t xml:space="preserve">, and </w:t>
-      </w:r>
-      <w:proofErr w:type="spellStart"/>
-      <w:r>
-        <w:t>product_price</w:t>
-      </w:r>
-      <w:proofErr w:type="spellEnd"/>
-      <w:r>
-        <w:t>.</w:t>
-      </w:r>
-    </w:p>
-    <w:p>
-      <w:pPr>
-        <w:pStyle w:val="a2"/>
-        <w:numPr>
-          <w:ilvl w:val="1"/>
-          <w:numId w:val="54"/>
-        </w:numPr>
-      </w:pPr>
-      <w:r>
-        <w:rPr>
-          <w:b/>
-          <w:bCs/>
-        </w:rPr>
-        <w:t>Quantity Sold:</w:t>
-      </w:r>
-    </w:p>
-    <w:p>
-      <w:pPr>
-        <w:pStyle w:val="a2"/>
-        <w:numPr>
-          <w:ilvl w:val="2"/>
-          <w:numId w:val="54"/>
-        </w:numPr>
-      </w:pPr>
-      <w:r>
-        <w:t>The first dataset uses quantity.</w:t>
-      </w:r>
-    </w:p>
-    <w:p>
-      <w:pPr>
-        <w:pStyle w:val="a2"/>
-        <w:numPr>
-          <w:ilvl w:val="2"/>
-          <w:numId w:val="54"/>
-        </w:numPr>
-      </w:pPr>
-      <w:r>
-        <w:t xml:space="preserve">The second dataset uses </w:t>
-      </w:r>
-      <w:proofErr w:type="spellStart"/>
-      <w:r>
-        <w:t>quantity_sold</w:t>
-      </w:r>
-      <w:proofErr w:type="spellEnd"/>
-      <w:r>
-        <w:t>.</w:t>
-      </w:r>
-    </w:p>
-    <w:p>
-      <w:pPr>
-        <w:pStyle w:val="a2"/>
-        <w:numPr>
-          <w:ilvl w:val="1"/>
-          <w:numId w:val="54"/>
-        </w:numPr>
-      </w:pPr>
-      <w:r>
-        <w:rPr>
-          <w:b/>
-          <w:bCs/>
-        </w:rPr>
-        <w:t>Discount:</w:t>
-      </w:r>
-    </w:p>
-    <w:p>
-      <w:pPr>
-        <w:pStyle w:val="a2"/>
-        <w:numPr>
-          <w:ilvl w:val="2"/>
-          <w:numId w:val="54"/>
-        </w:numPr>
-      </w:pPr>
-      <w:r>
-        <w:t>The first dataset uses discount%.</w:t>
-      </w:r>
-    </w:p>
-    <w:p>
-      <w:pPr>
-        <w:pStyle w:val="a2"/>
-        <w:numPr>
-          <w:ilvl w:val="2"/>
-          <w:numId w:val="54"/>
-        </w:numPr>
-      </w:pPr>
-      <w:r>
-        <w:t xml:space="preserve">The second dataset uses </w:t>
-      </w:r>
-      <w:proofErr w:type="spellStart"/>
-      <w:r>
-        <w:t>discount_percentage</w:t>
-      </w:r>
-      <w:proofErr w:type="spellEnd"/>
-      <w:r>
-        <w:t>.</w:t>
-      </w:r>
-    </w:p>
-    <w:p>
-      <w:pPr>
-        <w:pStyle w:val="a2"/>
-        <w:numPr>
-          <w:ilvl w:val="1"/>
-          <w:numId w:val="54"/>
-        </w:numPr>
-      </w:pPr>
-      <w:r>
-        <w:rPr>
-          <w:b/>
-          <w:bCs/>
-        </w:rPr>
-        <w:t>Transaction Amount:</w:t>
-      </w:r>
-    </w:p>
-    <w:p>
-      <w:pPr>
-        <w:pStyle w:val="a2"/>
-        <w:numPr>
-          <w:ilvl w:val="2"/>
-          <w:numId w:val="54"/>
-        </w:numPr>
-      </w:pPr>
-      <w:r>
-        <w:t xml:space="preserve">The first dataset uses </w:t>
-      </w:r>
-      <w:proofErr w:type="spellStart"/>
-      <w:r>
-        <w:t>transaction_amount</w:t>
-      </w:r>
-      <w:proofErr w:type="spellEnd"/>
-      <w:r>
-        <w:t>.</w:t>
-      </w:r>
-    </w:p>
-    <w:p>
-      <w:pPr>
-        <w:pStyle w:val="a2"/>
-        <w:numPr>
-          <w:ilvl w:val="2"/>
-          <w:numId w:val="54"/>
-        </w:numPr>
-      </w:pPr>
-      <w:r>
-        <w:t xml:space="preserve">The second dataset uses </w:t>
-      </w:r>
-      <w:proofErr w:type="spellStart"/>
-      <w:r>
-        <w:t>payment_amount</w:t>
-      </w:r>
-      <w:proofErr w:type="spellEnd"/>
-      <w:r>
-        <w:t>.</w:t>
-      </w:r>
-    </w:p>
-    <w:p>
-      <w:pPr>
-        <w:pStyle w:val="a2"/>
-        <w:numPr>
-          <w:ilvl w:val="1"/>
-          <w:numId w:val="54"/>
-        </w:numPr>
-      </w:pPr>
-      <w:r>
-        <w:rPr>
-          <w:b/>
-          <w:bCs/>
-        </w:rPr>
-        <w:t>Customer and Point Information:</w:t>
-      </w:r>
-    </w:p>
-    <w:p>
-      <w:pPr>
-        <w:pStyle w:val="a2"/>
-        <w:numPr>
-          <w:ilvl w:val="2"/>
-          <w:numId w:val="54"/>
-        </w:numPr>
-      </w:pPr>
-      <w:r>
-        <w:t xml:space="preserve">The first dataset uses customer, country, city, address, and </w:t>
-      </w:r>
-      <w:proofErr w:type="spellStart"/>
-      <w:r>
-        <w:t>point_name</w:t>
-      </w:r>
-      <w:proofErr w:type="spellEnd"/>
-      <w:r>
-        <w:t>.</w:t>
-      </w:r>
-    </w:p>
-    <w:p>
-      <w:pPr>
-        <w:pStyle w:val="a2"/>
-        <w:numPr>
-          <w:ilvl w:val="2"/>
-          <w:numId w:val="54"/>
-        </w:numPr>
-      </w:pPr>
-      <w:r>
-        <w:t xml:space="preserve">The second dataset uses </w:t>
-      </w:r>
-      <w:proofErr w:type="spellStart"/>
-      <w:r>
-        <w:t>customer_of_point</w:t>
-      </w:r>
-      <w:proofErr w:type="spellEnd"/>
-      <w:r>
-        <w:t xml:space="preserve">, </w:t>
-      </w:r>
-      <w:proofErr w:type="spellStart"/>
-      <w:r>
-        <w:t>country_of_point</w:t>
-      </w:r>
-      <w:proofErr w:type="spellEnd"/>
-      <w:r>
-        <w:t xml:space="preserve">, </w:t>
-      </w:r>
-      <w:proofErr w:type="spellStart"/>
-      <w:r>
-        <w:t>city_of_point</w:t>
-      </w:r>
-      <w:proofErr w:type="spellEnd"/>
-      <w:r>
-        <w:t xml:space="preserve">, </w:t>
-      </w:r>
-      <w:proofErr w:type="spellStart"/>
-      <w:r>
-        <w:t>address_of_point</w:t>
-      </w:r>
-      <w:proofErr w:type="spellEnd"/>
-      <w:r>
-        <w:t xml:space="preserve">, and </w:t>
-      </w:r>
-      <w:proofErr w:type="spellStart"/>
-      <w:r>
-        <w:t>name_of_point</w:t>
-      </w:r>
-      <w:proofErr w:type="spellEnd"/>
-      <w:r>
-        <w:t>.</w:t>
-      </w:r>
-    </w:p>
-    <w:p>
-      <w:pPr>
-        <w:pStyle w:val="a2"/>
-        <w:numPr>
-          <w:ilvl w:val="1"/>
-          <w:numId w:val="54"/>
-        </w:numPr>
-      </w:pPr>
-      <w:r>
-        <w:rPr>
-          <w:b/>
-          <w:bCs/>
-        </w:rPr>
-        <w:t>Employee Information:</w:t>
-      </w:r>
-    </w:p>
-    <w:p>
-      <w:pPr>
-        <w:pStyle w:val="a2"/>
-        <w:numPr>
-          <w:ilvl w:val="2"/>
-          <w:numId w:val="54"/>
-        </w:numPr>
-      </w:pPr>
-      <w:r>
-        <w:t>The first dataset uses employee.</w:t>
-      </w:r>
-    </w:p>
-    <w:p>
-      <w:pPr>
-        <w:pStyle w:val="a2"/>
-        <w:numPr>
-          <w:ilvl w:val="2"/>
-          <w:numId w:val="54"/>
-        </w:numPr>
-      </w:pPr>
-      <w:r>
-        <w:t xml:space="preserve">The second dataset uses </w:t>
-      </w:r>
-      <w:proofErr w:type="spellStart"/>
-      <w:r>
-        <w:t>employee_of_point</w:t>
-      </w:r>
-      <w:proofErr w:type="spellEnd"/>
-      <w:r>
-        <w:t>.</w:t>
-      </w:r>
-    </w:p>
-    <w:p>
-      <w:pPr>
-        <w:pStyle w:val="a2"/>
-        <w:numPr>
-          <w:ilvl w:val="0"/>
-          <w:numId w:val="54"/>
-        </w:numPr>
-      </w:pPr>
-      <w:r>
-        <w:rPr>
-          <w:b/>
-          <w:bCs/>
-        </w:rPr>
-        <w:t>Consistency in Attribute Values:</w:t>
-      </w:r>
-    </w:p>
-    <w:p>
-      <w:pPr>
-        <w:pStyle w:val="a2"/>
-        <w:numPr>
-          <w:ilvl w:val="1"/>
-          <w:numId w:val="54"/>
-        </w:numPr>
-      </w:pPr>
-      <w:r>
-        <w:t>Both datasets cover key transactional details such as dates, products, discounts, and point-of-sale information.</w:t>
       </w:r>
     </w:p>
     <w:p>
@@ -7622,6 +7660,119 @@
     </w:lvl>
   </w:abstractNum>
   <w:abstractNum w:abstractNumId="21" w15:restartNumberingAfterBreak="0">
+    <w:nsid w:val="36C439FE"/>
+    <w:multiLevelType w:val="hybridMultilevel"/>
+    <w:tmpl w:val="0F161AA4"/>
+    <w:lvl w:ilvl="0" w:tplc="04090001">
+      <w:start w:val="1"/>
+      <w:numFmt w:val="bullet"/>
+      <w:lvlText w:val=""/>
+      <w:lvlJc w:val="left"/>
+      <w:pPr>
+        <w:ind w:left="720" w:hanging="360"/>
+      </w:pPr>
+      <w:rPr>
+        <w:rFonts w:ascii="Symbol" w:hAnsi="Symbol" w:hint="default"/>
+      </w:rPr>
+    </w:lvl>
+    <w:lvl w:ilvl="1" w:tplc="04090003" w:tentative="1">
+      <w:start w:val="1"/>
+      <w:numFmt w:val="bullet"/>
+      <w:lvlText w:val="o"/>
+      <w:lvlJc w:val="left"/>
+      <w:pPr>
+        <w:ind w:left="1440" w:hanging="360"/>
+      </w:pPr>
+      <w:rPr>
+        <w:rFonts w:ascii="Courier New" w:hAnsi="Courier New" w:cs="Courier New" w:hint="default"/>
+      </w:rPr>
+    </w:lvl>
+    <w:lvl w:ilvl="2" w:tplc="04090005" w:tentative="1">
+      <w:start w:val="1"/>
+      <w:numFmt w:val="bullet"/>
+      <w:lvlText w:val=""/>
+      <w:lvlJc w:val="left"/>
+      <w:pPr>
+        <w:ind w:left="2160" w:hanging="360"/>
+      </w:pPr>
+      <w:rPr>
+        <w:rFonts w:ascii="Wingdings" w:hAnsi="Wingdings" w:hint="default"/>
+      </w:rPr>
+    </w:lvl>
+    <w:lvl w:ilvl="3" w:tplc="04090001" w:tentative="1">
+      <w:start w:val="1"/>
+      <w:numFmt w:val="bullet"/>
+      <w:lvlText w:val=""/>
+      <w:lvlJc w:val="left"/>
+      <w:pPr>
+        <w:ind w:left="2880" w:hanging="360"/>
+      </w:pPr>
+      <w:rPr>
+        <w:rFonts w:ascii="Symbol" w:hAnsi="Symbol" w:hint="default"/>
+      </w:rPr>
+    </w:lvl>
+    <w:lvl w:ilvl="4" w:tplc="04090003" w:tentative="1">
+      <w:start w:val="1"/>
+      <w:numFmt w:val="bullet"/>
+      <w:lvlText w:val="o"/>
+      <w:lvlJc w:val="left"/>
+      <w:pPr>
+        <w:ind w:left="3600" w:hanging="360"/>
+      </w:pPr>
+      <w:rPr>
+        <w:rFonts w:ascii="Courier New" w:hAnsi="Courier New" w:cs="Courier New" w:hint="default"/>
+      </w:rPr>
+    </w:lvl>
+    <w:lvl w:ilvl="5" w:tplc="04090005" w:tentative="1">
+      <w:start w:val="1"/>
+      <w:numFmt w:val="bullet"/>
+      <w:lvlText w:val=""/>
+      <w:lvlJc w:val="left"/>
+      <w:pPr>
+        <w:ind w:left="4320" w:hanging="360"/>
+      </w:pPr>
+      <w:rPr>
+        <w:rFonts w:ascii="Wingdings" w:hAnsi="Wingdings" w:hint="default"/>
+      </w:rPr>
+    </w:lvl>
+    <w:lvl w:ilvl="6" w:tplc="04090001" w:tentative="1">
+      <w:start w:val="1"/>
+      <w:numFmt w:val="bullet"/>
+      <w:lvlText w:val=""/>
+      <w:lvlJc w:val="left"/>
+      <w:pPr>
+        <w:ind w:left="5040" w:hanging="360"/>
+      </w:pPr>
+      <w:rPr>
+        <w:rFonts w:ascii="Symbol" w:hAnsi="Symbol" w:hint="default"/>
+      </w:rPr>
+    </w:lvl>
+    <w:lvl w:ilvl="7" w:tplc="04090003" w:tentative="1">
+      <w:start w:val="1"/>
+      <w:numFmt w:val="bullet"/>
+      <w:lvlText w:val="o"/>
+      <w:lvlJc w:val="left"/>
+      <w:pPr>
+        <w:ind w:left="5760" w:hanging="360"/>
+      </w:pPr>
+      <w:rPr>
+        <w:rFonts w:ascii="Courier New" w:hAnsi="Courier New" w:cs="Courier New" w:hint="default"/>
+      </w:rPr>
+    </w:lvl>
+    <w:lvl w:ilvl="8" w:tplc="04090005" w:tentative="1">
+      <w:start w:val="1"/>
+      <w:numFmt w:val="bullet"/>
+      <w:lvlText w:val=""/>
+      <w:lvlJc w:val="left"/>
+      <w:pPr>
+        <w:ind w:left="6480" w:hanging="360"/>
+      </w:pPr>
+      <w:rPr>
+        <w:rFonts w:ascii="Wingdings" w:hAnsi="Wingdings" w:hint="default"/>
+      </w:rPr>
+    </w:lvl>
+  </w:abstractNum>
+  <w:abstractNum w:abstractNumId="22" w15:restartNumberingAfterBreak="0">
     <w:nsid w:val="37FF64A4"/>
     <w:multiLevelType w:val="multilevel"/>
     <w:tmpl w:val="880CB696"/>
@@ -7770,7 +7921,7 @@
       </w:rPr>
     </w:lvl>
   </w:abstractNum>
-  <w:abstractNum w:abstractNumId="22" w15:restartNumberingAfterBreak="0">
+  <w:abstractNum w:abstractNumId="23" w15:restartNumberingAfterBreak="0">
     <w:nsid w:val="393E395F"/>
     <w:multiLevelType w:val="multilevel"/>
     <w:tmpl w:val="444685D6"/>
@@ -7919,7 +8070,7 @@
       </w:rPr>
     </w:lvl>
   </w:abstractNum>
-  <w:abstractNum w:abstractNumId="23" w15:restartNumberingAfterBreak="0">
+  <w:abstractNum w:abstractNumId="24" w15:restartNumberingAfterBreak="0">
     <w:nsid w:val="3B0B5D62"/>
     <w:multiLevelType w:val="multilevel"/>
     <w:tmpl w:val="61AA31C6"/>
@@ -8068,7 +8219,7 @@
       </w:rPr>
     </w:lvl>
   </w:abstractNum>
-  <w:abstractNum w:abstractNumId="24" w15:restartNumberingAfterBreak="0">
+  <w:abstractNum w:abstractNumId="25" w15:restartNumberingAfterBreak="0">
     <w:nsid w:val="3C072240"/>
     <w:multiLevelType w:val="multilevel"/>
     <w:tmpl w:val="43D489EA"/>
@@ -8217,7 +8368,7 @@
       </w:rPr>
     </w:lvl>
   </w:abstractNum>
-  <w:abstractNum w:abstractNumId="25" w15:restartNumberingAfterBreak="0">
+  <w:abstractNum w:abstractNumId="26" w15:restartNumberingAfterBreak="0">
     <w:nsid w:val="3C5A0EF0"/>
     <w:multiLevelType w:val="hybridMultilevel"/>
     <w:tmpl w:val="3C502EE8"/>
@@ -8357,7 +8508,7 @@
       </w:rPr>
     </w:lvl>
   </w:abstractNum>
-  <w:abstractNum w:abstractNumId="26" w15:restartNumberingAfterBreak="0">
+  <w:abstractNum w:abstractNumId="27" w15:restartNumberingAfterBreak="0">
     <w:nsid w:val="3C734764"/>
     <w:multiLevelType w:val="multilevel"/>
     <w:tmpl w:val="3A7CF21C"/>
@@ -8470,7 +8621,7 @@
       </w:pPr>
     </w:lvl>
   </w:abstractNum>
-  <w:abstractNum w:abstractNumId="27" w15:restartNumberingAfterBreak="0">
+  <w:abstractNum w:abstractNumId="28" w15:restartNumberingAfterBreak="0">
     <w:nsid w:val="44273C12"/>
     <w:multiLevelType w:val="multilevel"/>
     <w:tmpl w:val="648842EE"/>
@@ -8619,7 +8770,7 @@
       </w:rPr>
     </w:lvl>
   </w:abstractNum>
-  <w:abstractNum w:abstractNumId="28" w15:restartNumberingAfterBreak="0">
+  <w:abstractNum w:abstractNumId="29" w15:restartNumberingAfterBreak="0">
     <w:nsid w:val="486A47FD"/>
     <w:multiLevelType w:val="multilevel"/>
     <w:tmpl w:val="04090023"/>
@@ -8733,7 +8884,7 @@
       </w:pPr>
     </w:lvl>
   </w:abstractNum>
-  <w:abstractNum w:abstractNumId="29" w15:restartNumberingAfterBreak="0">
+  <w:abstractNum w:abstractNumId="30" w15:restartNumberingAfterBreak="0">
     <w:nsid w:val="4889713E"/>
     <w:multiLevelType w:val="multilevel"/>
     <w:tmpl w:val="4F56EF90"/>
@@ -8882,7 +9033,7 @@
       </w:rPr>
     </w:lvl>
   </w:abstractNum>
-  <w:abstractNum w:abstractNumId="30" w15:restartNumberingAfterBreak="0">
+  <w:abstractNum w:abstractNumId="31" w15:restartNumberingAfterBreak="0">
     <w:nsid w:val="4AAD083A"/>
     <w:multiLevelType w:val="multilevel"/>
     <w:tmpl w:val="7F6022C2"/>
@@ -9031,7 +9182,7 @@
       </w:rPr>
     </w:lvl>
   </w:abstractNum>
-  <w:abstractNum w:abstractNumId="31" w15:restartNumberingAfterBreak="0">
+  <w:abstractNum w:abstractNumId="32" w15:restartNumberingAfterBreak="0">
     <w:nsid w:val="4CFA5342"/>
     <w:multiLevelType w:val="multilevel"/>
     <w:tmpl w:val="B58067EE"/>
@@ -9144,7 +9295,7 @@
       </w:pPr>
     </w:lvl>
   </w:abstractNum>
-  <w:abstractNum w:abstractNumId="32" w15:restartNumberingAfterBreak="0">
+  <w:abstractNum w:abstractNumId="33" w15:restartNumberingAfterBreak="0">
     <w:nsid w:val="504F349B"/>
     <w:multiLevelType w:val="multilevel"/>
     <w:tmpl w:val="DC2E8DA0"/>
@@ -9257,7 +9408,7 @@
       </w:pPr>
     </w:lvl>
   </w:abstractNum>
-  <w:abstractNum w:abstractNumId="33" w15:restartNumberingAfterBreak="0">
+  <w:abstractNum w:abstractNumId="34" w15:restartNumberingAfterBreak="0">
     <w:nsid w:val="54587163"/>
     <w:multiLevelType w:val="multilevel"/>
     <w:tmpl w:val="5C5CB950"/>
@@ -9406,13 +9557,13 @@
       </w:rPr>
     </w:lvl>
   </w:abstractNum>
-  <w:abstractNum w:abstractNumId="34" w15:restartNumberingAfterBreak="0">
+  <w:abstractNum w:abstractNumId="35" w15:restartNumberingAfterBreak="0">
     <w:nsid w:val="57DD6F34"/>
     <w:multiLevelType w:val="multilevel"/>
     <w:tmpl w:val="1436B0F0"/>
     <w:numStyleLink w:val="NumberList"/>
   </w:abstractNum>
-  <w:abstractNum w:abstractNumId="35" w15:restartNumberingAfterBreak="0">
+  <w:abstractNum w:abstractNumId="36" w15:restartNumberingAfterBreak="0">
     <w:nsid w:val="58155A8A"/>
     <w:multiLevelType w:val="multilevel"/>
     <w:tmpl w:val="EE7A7A12"/>
@@ -9514,7 +9665,7 @@
       </w:pPr>
     </w:lvl>
   </w:abstractNum>
-  <w:abstractNum w:abstractNumId="36" w15:restartNumberingAfterBreak="0">
+  <w:abstractNum w:abstractNumId="37" w15:restartNumberingAfterBreak="0">
     <w:nsid w:val="63CE2E1E"/>
     <w:multiLevelType w:val="multilevel"/>
     <w:tmpl w:val="CBFC3592"/>
@@ -9663,7 +9814,7 @@
       </w:rPr>
     </w:lvl>
   </w:abstractNum>
-  <w:abstractNum w:abstractNumId="37" w15:restartNumberingAfterBreak="0">
+  <w:abstractNum w:abstractNumId="38" w15:restartNumberingAfterBreak="0">
     <w:nsid w:val="6897445E"/>
     <w:multiLevelType w:val="multilevel"/>
     <w:tmpl w:val="088C5968"/>
@@ -9812,7 +9963,7 @@
       </w:rPr>
     </w:lvl>
   </w:abstractNum>
-  <w:abstractNum w:abstractNumId="38" w15:restartNumberingAfterBreak="0">
+  <w:abstractNum w:abstractNumId="39" w15:restartNumberingAfterBreak="0">
     <w:nsid w:val="6999626C"/>
     <w:multiLevelType w:val="multilevel"/>
     <w:tmpl w:val="3E34E62E"/>
@@ -9961,7 +10112,7 @@
       </w:rPr>
     </w:lvl>
   </w:abstractNum>
-  <w:abstractNum w:abstractNumId="39" w15:restartNumberingAfterBreak="0">
+  <w:abstractNum w:abstractNumId="40" w15:restartNumberingAfterBreak="0">
     <w:nsid w:val="6F3A4761"/>
     <w:multiLevelType w:val="multilevel"/>
     <w:tmpl w:val="24E6E224"/>
@@ -10074,7 +10225,7 @@
       </w:pPr>
     </w:lvl>
   </w:abstractNum>
-  <w:abstractNum w:abstractNumId="40" w15:restartNumberingAfterBreak="0">
+  <w:abstractNum w:abstractNumId="41" w15:restartNumberingAfterBreak="0">
     <w:nsid w:val="712D2B33"/>
     <w:multiLevelType w:val="multilevel"/>
     <w:tmpl w:val="F1201418"/>
@@ -10187,7 +10338,7 @@
       </w:pPr>
     </w:lvl>
   </w:abstractNum>
-  <w:abstractNum w:abstractNumId="41" w15:restartNumberingAfterBreak="0">
+  <w:abstractNum w:abstractNumId="42" w15:restartNumberingAfterBreak="0">
     <w:nsid w:val="72E62EC6"/>
     <w:multiLevelType w:val="multilevel"/>
     <w:tmpl w:val="60CCCC0C"/>
@@ -10336,7 +10487,7 @@
       </w:rPr>
     </w:lvl>
   </w:abstractNum>
-  <w:abstractNum w:abstractNumId="42" w15:restartNumberingAfterBreak="0">
+  <w:abstractNum w:abstractNumId="43" w15:restartNumberingAfterBreak="0">
     <w:nsid w:val="75435DD2"/>
     <w:multiLevelType w:val="multilevel"/>
     <w:tmpl w:val="048EFDCE"/>
@@ -10485,7 +10636,7 @@
       </w:rPr>
     </w:lvl>
   </w:abstractNum>
-  <w:abstractNum w:abstractNumId="43" w15:restartNumberingAfterBreak="0">
+  <w:abstractNum w:abstractNumId="44" w15:restartNumberingAfterBreak="0">
     <w:nsid w:val="78005A41"/>
     <w:multiLevelType w:val="multilevel"/>
     <w:tmpl w:val="7E8C2960"/>
@@ -10634,14 +10785,14 @@
       </w:rPr>
     </w:lvl>
   </w:abstractNum>
-  <w:abstractNum w:abstractNumId="44" w15:restartNumberingAfterBreak="0">
+  <w:abstractNum w:abstractNumId="45" w15:restartNumberingAfterBreak="0">
     <w:nsid w:val="792F65C9"/>
     <w:multiLevelType w:val="multilevel"/>
-    <w:tmpl w:val="322C1280"/>
+    <w:tmpl w:val="FE9C6CC4"/>
     <w:lvl w:ilvl="0">
       <w:start w:val="1"/>
-      <w:numFmt w:val="decimal"/>
-      <w:lvlText w:val="%1."/>
+      <w:numFmt w:val="bullet"/>
+      <w:lvlText w:val=""/>
       <w:lvlJc w:val="left"/>
       <w:pPr>
         <w:tabs>
@@ -10649,6 +10800,9 @@
         </w:tabs>
         <w:ind w:left="720" w:hanging="360"/>
       </w:pPr>
+      <w:rPr>
+        <w:rFonts w:ascii="Symbol" w:hAnsi="Symbol" w:hint="default"/>
+      </w:rPr>
     </w:lvl>
     <w:lvl w:ilvl="1">
       <w:start w:val="1"/>
@@ -10755,7 +10909,7 @@
       </w:pPr>
     </w:lvl>
   </w:abstractNum>
-  <w:abstractNum w:abstractNumId="45" w15:restartNumberingAfterBreak="0">
+  <w:abstractNum w:abstractNumId="46" w15:restartNumberingAfterBreak="0">
     <w:nsid w:val="7BE26649"/>
     <w:multiLevelType w:val="multilevel"/>
     <w:tmpl w:val="A83C95D2"/>
@@ -10904,7 +11058,7 @@
       </w:rPr>
     </w:lvl>
   </w:abstractNum>
-  <w:abstractNum w:abstractNumId="46" w15:restartNumberingAfterBreak="0">
+  <w:abstractNum w:abstractNumId="47" w15:restartNumberingAfterBreak="0">
     <w:nsid w:val="7DA62F63"/>
     <w:multiLevelType w:val="multilevel"/>
     <w:tmpl w:val="575863B2"/>
@@ -11053,7 +11207,7 @@
       </w:rPr>
     </w:lvl>
   </w:abstractNum>
-  <w:abstractNum w:abstractNumId="47" w15:restartNumberingAfterBreak="0">
+  <w:abstractNum w:abstractNumId="48" w15:restartNumberingAfterBreak="0">
     <w:nsid w:val="7ECA4DDE"/>
     <w:multiLevelType w:val="hybridMultilevel"/>
     <w:tmpl w:val="220478B4"/>
@@ -11139,7 +11293,7 @@
       </w:pPr>
     </w:lvl>
   </w:abstractNum>
-  <w:abstractNum w:abstractNumId="48" w15:restartNumberingAfterBreak="0">
+  <w:abstractNum w:abstractNumId="49" w15:restartNumberingAfterBreak="0">
     <w:nsid w:val="7F0A6855"/>
     <w:multiLevelType w:val="multilevel"/>
     <w:tmpl w:val="B9D00FBC"/>
@@ -11307,7 +11461,7 @@
     <w:abstractNumId w:val="8"/>
   </w:num>
   <w:num w:numId="7" w16cid:durableId="1617325366">
-    <w:abstractNumId w:val="47"/>
+    <w:abstractNumId w:val="48"/>
   </w:num>
   <w:num w:numId="8" w16cid:durableId="2131194476">
     <w:abstractNumId w:val="20"/>
@@ -11343,10 +11497,10 @@
     </w:lvlOverride>
   </w:num>
   <w:num w:numId="10" w16cid:durableId="1239826050">
-    <w:abstractNumId w:val="35"/>
+    <w:abstractNumId w:val="36"/>
   </w:num>
   <w:num w:numId="11" w16cid:durableId="1047994370">
-    <w:abstractNumId w:val="35"/>
+    <w:abstractNumId w:val="36"/>
     <w:lvlOverride w:ilvl="0"/>
     <w:lvlOverride w:ilvl="1"/>
     <w:lvlOverride w:ilvl="2"/>
@@ -11370,7 +11524,7 @@
     </w:lvlOverride>
   </w:num>
   <w:num w:numId="12" w16cid:durableId="139814723">
-    <w:abstractNumId w:val="34"/>
+    <w:abstractNumId w:val="35"/>
     <w:lvlOverride w:ilvl="0">
       <w:startOverride w:val="1"/>
     </w:lvlOverride>
@@ -11403,10 +11557,10 @@
     <w:abstractNumId w:val="4"/>
   </w:num>
   <w:num w:numId="14" w16cid:durableId="697778143">
-    <w:abstractNumId w:val="28"/>
+    <w:abstractNumId w:val="29"/>
   </w:num>
   <w:num w:numId="15" w16cid:durableId="1997491479">
-    <w:abstractNumId w:val="25"/>
+    <w:abstractNumId w:val="26"/>
   </w:num>
   <w:num w:numId="16" w16cid:durableId="1198546483">
     <w:abstractNumId w:val="16"/>
@@ -11430,10 +11584,10 @@
     <w:abstractNumId w:val="17"/>
   </w:num>
   <w:num w:numId="22" w16cid:durableId="475297542">
-    <w:abstractNumId w:val="45"/>
+    <w:abstractNumId w:val="46"/>
   </w:num>
   <w:num w:numId="23" w16cid:durableId="594632380">
-    <w:abstractNumId w:val="37"/>
+    <w:abstractNumId w:val="38"/>
   </w:num>
   <w:num w:numId="24" w16cid:durableId="1218516210">
     <w:abstractNumId w:val="11"/>
@@ -11451,31 +11605,31 @@
     <w:abstractNumId w:val="13"/>
   </w:num>
   <w:num w:numId="29" w16cid:durableId="143472318">
-    <w:abstractNumId w:val="39"/>
+    <w:abstractNumId w:val="40"/>
   </w:num>
   <w:num w:numId="30" w16cid:durableId="431704120">
-    <w:abstractNumId w:val="27"/>
+    <w:abstractNumId w:val="28"/>
   </w:num>
   <w:num w:numId="31" w16cid:durableId="1683437953">
+    <w:abstractNumId w:val="33"/>
+  </w:num>
+  <w:num w:numId="32" w16cid:durableId="1768304097">
+    <w:abstractNumId w:val="31"/>
+  </w:num>
+  <w:num w:numId="33" w16cid:durableId="1027677625">
     <w:abstractNumId w:val="32"/>
   </w:num>
-  <w:num w:numId="32" w16cid:durableId="1768304097">
-    <w:abstractNumId w:val="30"/>
-  </w:num>
-  <w:num w:numId="33" w16cid:durableId="1027677625">
-    <w:abstractNumId w:val="31"/>
-  </w:num>
   <w:num w:numId="34" w16cid:durableId="58794978">
-    <w:abstractNumId w:val="46"/>
+    <w:abstractNumId w:val="47"/>
   </w:num>
   <w:num w:numId="35" w16cid:durableId="1892181749">
-    <w:abstractNumId w:val="26"/>
+    <w:abstractNumId w:val="27"/>
   </w:num>
   <w:num w:numId="36" w16cid:durableId="1083456094">
     <w:abstractNumId w:val="3"/>
   </w:num>
   <w:num w:numId="37" w16cid:durableId="828325972">
-    <w:abstractNumId w:val="40"/>
+    <w:abstractNumId w:val="41"/>
   </w:num>
   <w:num w:numId="38" w16cid:durableId="2044288500">
     <w:abstractNumId w:val="6"/>
@@ -11484,49 +11638,52 @@
     <w:abstractNumId w:val="19"/>
   </w:num>
   <w:num w:numId="40" w16cid:durableId="2113427818">
-    <w:abstractNumId w:val="23"/>
+    <w:abstractNumId w:val="24"/>
   </w:num>
   <w:num w:numId="41" w16cid:durableId="1240292356">
-    <w:abstractNumId w:val="41"/>
+    <w:abstractNumId w:val="42"/>
   </w:num>
   <w:num w:numId="42" w16cid:durableId="36973025">
-    <w:abstractNumId w:val="29"/>
+    <w:abstractNumId w:val="30"/>
   </w:num>
   <w:num w:numId="43" w16cid:durableId="1736734410">
-    <w:abstractNumId w:val="33"/>
+    <w:abstractNumId w:val="34"/>
   </w:num>
   <w:num w:numId="44" w16cid:durableId="1891917996">
     <w:abstractNumId w:val="0"/>
   </w:num>
   <w:num w:numId="45" w16cid:durableId="931084316">
-    <w:abstractNumId w:val="42"/>
+    <w:abstractNumId w:val="43"/>
   </w:num>
   <w:num w:numId="46" w16cid:durableId="336925172">
-    <w:abstractNumId w:val="38"/>
+    <w:abstractNumId w:val="39"/>
   </w:num>
   <w:num w:numId="47" w16cid:durableId="1554730912">
-    <w:abstractNumId w:val="43"/>
+    <w:abstractNumId w:val="44"/>
   </w:num>
   <w:num w:numId="48" w16cid:durableId="1855995261">
-    <w:abstractNumId w:val="48"/>
+    <w:abstractNumId w:val="49"/>
   </w:num>
   <w:num w:numId="49" w16cid:durableId="398207593">
-    <w:abstractNumId w:val="21"/>
+    <w:abstractNumId w:val="22"/>
   </w:num>
   <w:num w:numId="50" w16cid:durableId="697200932">
-    <w:abstractNumId w:val="24"/>
+    <w:abstractNumId w:val="25"/>
   </w:num>
   <w:num w:numId="51" w16cid:durableId="25296964">
-    <w:abstractNumId w:val="22"/>
+    <w:abstractNumId w:val="23"/>
   </w:num>
   <w:num w:numId="52" w16cid:durableId="1068266037">
-    <w:abstractNumId w:val="36"/>
+    <w:abstractNumId w:val="37"/>
   </w:num>
   <w:num w:numId="53" w16cid:durableId="1190992950">
     <w:abstractNumId w:val="15"/>
   </w:num>
   <w:num w:numId="54" w16cid:durableId="525757273">
-    <w:abstractNumId w:val="44"/>
+    <w:abstractNumId w:val="45"/>
+  </w:num>
+  <w:num w:numId="55" w16cid:durableId="811141031">
+    <w:abstractNumId w:val="21"/>
   </w:num>
 </w:numbering>
 </file>

</xml_diff>